<commit_message>
Add BatchNorm final candidate and refresh report
</commit_message>
<xml_diff>
--- a/report/Grup12_KorayÖztürk_EmirAlpİlhan_Final_Rapor.docx
+++ b/report/Grup12_KorayÖztürk_EmirAlpİlhan_Final_Rapor.docx
@@ -217,7 +217,7 @@
         <w:t xml:space="preserve">Özet - </w:t>
       </w:r>
       <w:r>
-        <w:t>Bu çalışmada retinal OCT görüntülerinde patolojik örneklerin tespiti için yalnızca normal görüntülerle eğitilen konvolüsyonel autoencoder tabanlı bir anomali tespit hattı geliştirilmiştir. Kermany OCT2017/Mendeley veri kümesinde eğitim aşamasına sadece NORMAL sınıfı alınmış, doğrulama bölmesi hasta kimliği kullanılarak ayrılmış ve test aşamasında CNV, DME, DRUSEN ve NORMAL örnekleri binary anomaly detection problemi olarak değerlendirilmiştir. Final aşamasında ara baseline korunmuş; VAE+KL, L1, MSE+SSIM, latent boyut, batch size, crop ön işleme, learning rate scheduler, farklı anomaly score'lar, hasta düzeyi birleştirme ve bootstrap güven aralığı denemeleri eklenmiştir. En iyi image-level sonuç, ReduceLROnPlateau ile 60 epoch eğitilen AE-MSE modelinin topk_mse_5 score'u ile AUROC 0.9474, F1 0.8515, precision 0.9860, recall 0.7493 ve FPR 0.0320 olarak bulunmuştur. Hasta düzeyinde mean aggregation ile F1 0.9066 elde edilmiştir. Sonuçlar top-k residual score'un klasik ortalama MSE'ye göre daha ayırt edici olduğunu, buna karşılık DRUSEN örneklerinin hala en zor patolojik grup olduğunu göstermektedir.</w:t>
+        <w:t>Bu çalışmada retinal OCT görüntülerinde patolojik örneklerin tespiti için yalnızca normal görüntülerle eğitilen konvolüsyonel autoencoder tabanlı bir anomali tespit hattı geliştirilmiştir. Kermany OCT2017/Mendeley veri kümesinde eğitim aşamasına sadece NORMAL sınıfı alınmış, doğrulama bölmesi hasta kimliği kullanılarak ayrılmış ve test aşamasında CNV, DME, DRUSEN ve NORMAL örnekleri binary anomaly detection problemi olarak değerlendirilmiştir. Final aşamasında ara baseline korunmuş; VAE+KL, L1, MSE+SSIM, latent boyut, batch size, crop ön işleme, learning rate scheduler, BatchNorm, farklı anomaly score'lar, hasta düzeyi birleştirme ve bootstrap güven aralığı denemeleri eklenmiştir. En iyi image-level sonuç, BatchNorm ve ReduceLROnPlateau ile 60 epoch eğitilen AE-MSE modelinin topk_mse_5 score'u ile AUROC 0.9487, F1 0.8593, precision 0.9862, recall 0.7613 ve FPR 0.0320 olarak bulunmuştur. Hasta düzeyinde mean aggregation ile F1 0.9089 elde edilmiştir. Sonuçlar top-k residual score'un klasik ortalama MSE'ye göre daha ayırt edici olduğunu, buna karşılık DRUSEN örneklerinin hala en zor patolojik grup olduğunu göstermektedir.</w:t>
       </w:r>
     </w:p>
     <w:p>
@@ -233,7 +233,7 @@
         <w:t xml:space="preserve">Abstract - </w:t>
       </w:r>
       <w:r>
-        <w:t>This project develops a convolutional autoencoder pipeline for detecting pathological retinal OCT images by learning only from normal samples. Using the Kermany OCT2017/Mendeley dataset, only NORMAL images were used for training, the validation subset was separated at patient level, and CNV, DME, DRUSEN and NORMAL test images were evaluated as a binary anomaly detection task. In the final stage, the baseline was extended with VAE+KL, L1, MSE+SSIM, latent-size and batch-size ablations, crop preprocessing trials, learning-rate scheduling, alternative anomaly scores, patient-level aggregation and bootstrap confidence intervals. The best image-level setting was the 60-epoch AE-MSE model trained with ReduceLROnPlateau and evaluated with topk_mse_5 scoring, reaching AUROC 0.9474, F1 0.8515, precision 0.9860, recall 0.7493 and FPR 0.0320. Patient-level mean aggregation achieved F1 0.9066. The findings indicate that localized top-k residual scoring improves separability over mean MSE, while DRUSEN remains the most challenging pathology group.</w:t>
+        <w:t>This project develops a convolutional autoencoder pipeline for detecting pathological retinal OCT images by learning only from normal samples. Using the Kermany OCT2017/Mendeley dataset, only NORMAL images were used for training, the validation subset was separated at patient level, and CNV, DME, DRUSEN and NORMAL test images were evaluated as a binary anomaly detection task. In the final stage, the baseline was extended with VAE+KL, L1, MSE+SSIM, latent-size and batch-size ablations, crop preprocessing trials, learning-rate scheduling, BatchNorm, alternative anomaly scores, patient-level aggregation and bootstrap confidence intervals. The best image-level setting was the 60-epoch AE-MSE model trained with BatchNorm and ReduceLROnPlateau and evaluated with topk_mse_5 scoring, reaching AUROC 0.9487, F1 0.8593, precision 0.9862, recall 0.7613 and FPR 0.0320. Patient-level mean aggregation achieved F1 0.9089. The findings indicate that localized top-k residual scoring improves separability over mean MSE, while DRUSEN remains the most challenging pathology group.</w:t>
       </w:r>
     </w:p>
     <w:p>
@@ -254,7 +254,7 @@
     </w:p>
     <w:p>
       <w:pPr>
-        <w:spacing w:before="100" w:after="60"/>
+        <w:spacing w:before="80" w:after="40"/>
         <w:jc w:val="center"/>
       </w:pPr>
       <w:r>
@@ -268,7 +268,7 @@
     </w:p>
     <w:p>
       <w:pPr>
-        <w:spacing w:after="60" w:line="240" w:lineRule="auto"/>
+        <w:spacing w:after="40" w:line="240" w:lineRule="auto"/>
         <w:jc w:val="both"/>
       </w:pPr>
       <w:r>
@@ -277,16 +277,16 @@
     </w:p>
     <w:p>
       <w:pPr>
-        <w:spacing w:after="60" w:line="240" w:lineRule="auto"/>
+        <w:spacing w:after="40" w:line="240" w:lineRule="auto"/>
         <w:jc w:val="both"/>
       </w:pPr>
       <w:r>
-        <w:t>Ara rapor aşamasında çalışan bir AE-MSE baseline kurulmuştu. Final aşamasında amaç sadece tek bir sonucu iyileştirmek değil, aynı zamanda hangi teknik kararların işe yaradığını sistematik olarak görmekti. Bu kapsamda VAE tabanlı üretken latent model, L1 ve SSIM içeren loss seçenekleri, latent boyut ve batch size ablasyonları, learning rate scheduler, boş alanları azaltmaya yönelik crop denemeleri, top-k residual score, hasta düzeyi değerlendirme, bootstrap güven aralığı ve nitel heatmap görselleri aynı deney hattına eklenmiştir. Bu nedenle final raporu ara rapordaki başlangıç fikrini temel almakla birlikte, asıl olarak finalde yapılan genişletmeleri ve bunların kontrollü karşılaştırmasını sunmaktadır. Böylece proje, yalnızca bir model çalıştırma örneği olmaktan çıkarılıp savunulabilir bir karşılaştırmalı analiz haline getirilmiştir.</w:t>
+        <w:t>Ara rapor aşamasında çalışan bir AE-MSE baseline kurulmuştu. Final aşamasında amaç sadece tek bir sonucu iyileştirmek değil, aynı zamanda hangi teknik kararların işe yaradığını sistematik olarak görmekti. Bu kapsamda VAE tabanlı üretken latent model, L1 ve SSIM içeren loss seçenekleri, latent boyut ve batch size ablasyonları, learning rate scheduler, BatchNorm, boş alanları azaltmaya yönelik crop denemeleri, top-k residual score, hasta düzeyi değerlendirme, bootstrap güven aralığı ve nitel heatmap görselleri aynı deney hattına eklenmiştir. Bu nedenle final raporu ara rapordaki başlangıç fikrini temel almakla birlikte, asıl olarak finalde yapılan genişletmeleri ve bunların kontrollü karşılaştırmasını sunmaktadır. Böylece proje, yalnızca bir model çalıştırma örneği olmaktan çıkarılıp savunulabilir bir karşılaştırmalı analiz haline getirilmiştir.</w:t>
       </w:r>
     </w:p>
     <w:p>
       <w:pPr>
-        <w:spacing w:before="100" w:after="60"/>
+        <w:spacing w:before="80" w:after="40"/>
         <w:jc w:val="center"/>
       </w:pPr>
       <w:r>
@@ -300,7 +300,7 @@
     </w:p>
     <w:p>
       <w:pPr>
-        <w:spacing w:after="60" w:line="240" w:lineRule="auto"/>
+        <w:spacing w:after="40" w:line="240" w:lineRule="auto"/>
         <w:jc w:val="both"/>
       </w:pPr>
       <w:r>
@@ -309,7 +309,7 @@
     </w:p>
     <w:p>
       <w:pPr>
-        <w:spacing w:after="60" w:line="240" w:lineRule="auto"/>
+        <w:spacing w:after="40" w:line="240" w:lineRule="auto"/>
         <w:jc w:val="both"/>
       </w:pPr>
       <w:r>
@@ -318,7 +318,7 @@
     </w:p>
     <w:p>
       <w:pPr>
-        <w:spacing w:after="60" w:line="240" w:lineRule="auto"/>
+        <w:spacing w:after="40" w:line="240" w:lineRule="auto"/>
         <w:jc w:val="both"/>
       </w:pPr>
       <w:r>
@@ -327,13 +327,13 @@
     </w:p>
     <w:p>
       <w:pPr>
-        <w:spacing w:before="60" w:after="40"/>
+        <w:spacing w:before="40" w:after="20"/>
         <w:jc w:val="center"/>
       </w:pPr>
       <w:r>
         <w:rPr>
           <w:b/>
-          <w:sz w:val="20"/>
+          <w:sz w:val="18"/>
         </w:rPr>
         <w:t>Tablo I. Literatürdeki ana kümeler ve bu projedeki karşılıkları.</w:t>
       </w:r>
@@ -353,10 +353,10 @@
           <w:insideV w:val="single" w:sz="6" w:space="0" w:color="000000"/>
         </w:tblBorders>
         <w:tblCellMar>
-          <w:top w:w="45" w:type="dxa"/>
-          <w:left w:w="45" w:type="dxa"/>
-          <w:bottom w:w="45" w:type="dxa"/>
-          <w:right w:w="45" w:type="dxa"/>
+          <w:top w:w="30" w:type="dxa"/>
+          <w:left w:w="30" w:type="dxa"/>
+          <w:bottom w:w="30" w:type="dxa"/>
+          <w:right w:w="30" w:type="dxa"/>
         </w:tblCellMar>
       </w:tblPr>
       <w:tblGrid>
@@ -724,7 +724,7 @@
     </w:tbl>
     <w:p>
       <w:pPr>
-        <w:spacing w:before="100" w:after="60"/>
+        <w:spacing w:before="80" w:after="40"/>
         <w:jc w:val="center"/>
       </w:pPr>
       <w:r>
@@ -738,7 +738,7 @@
     </w:p>
     <w:p>
       <w:pPr>
-        <w:spacing w:after="60" w:line="240" w:lineRule="auto"/>
+        <w:spacing w:after="40" w:line="240" w:lineRule="auto"/>
         <w:jc w:val="both"/>
       </w:pPr>
       <w:r>
@@ -747,16 +747,16 @@
     </w:p>
     <w:p>
       <w:pPr>
-        <w:spacing w:after="60" w:line="240" w:lineRule="auto"/>
+        <w:spacing w:after="40" w:line="240" w:lineRule="auto"/>
         <w:jc w:val="both"/>
       </w:pPr>
       <w:r>
-        <w:t>Ana model dört bloklu konvolüsyonel autoencoder yapısındadır. Encoder, görüntüyü düşük boyutlu latent temsile indirger; decoder aynı uzaydan görüntüyü yeniden oluşturur. Ana koşuda latent_dim=128, Adam optimizer, initial learning rate 1e-3, ReduceLROnPlateau scheduler, batch size 32, maksimum 60 epoch ve early stopping patience 10 kullanılmıştır. Scheduler validation loss plateau olduğunda learning rate'i factor 0.5 ile düşürecek şekilde ayarlanmıştır. Eğitim NVIDIA GeForce RTX 4060 Laptop GPU üzerinde yapılmış ve final koşu yaklaşık 46.9 dakika sürmüştür. VAE denemesinde encoder mu ve logvar üretmiş, reparameterization trick kullanılmış ve loss MSE + 1e-4 * KL olarak alınmıştır. SSIM denemesinde loss 0.8*MSE + 0.2*(1-SSIM), L1 denemesinde ise ortalama mutlak hata kullanılmıştır.</w:t>
+        <w:t>Ana model dört bloklu konvolüsyonel autoencoder yapısındadır. Encoder, görüntüyü düşük boyutlu latent temsile indirger; decoder aynı uzaydan görüntüyü yeniden oluşturur. Final koşuda her encoder Conv2d ve decoder ConvTranspose2d bloğundan sonra BatchNorm2d kullanılmıştır. Bu ekleme, ara aktivasyon dağılımlarını stabilize etmeyi ve eğitim sonunda daha düşük validation loss elde etmeyi amaçlamıştır. Ana koşuda latent_dim=128, Adam optimizer, initial learning rate 1e-3, ReduceLROnPlateau scheduler, batch size 32, maksimum 60 epoch ve early stopping patience 10 kullanılmıştır. Scheduler validation loss plateau olduğunda learning rate'i factor 0.5 ile düşürecek şekilde ayarlanmıştır. Eğitim NVIDIA GeForce RTX 4060 Laptop GPU üzerinde yapılmış ve final koşu yaklaşık 60.5 dakika sürmüştür. VAE denemesinde encoder mu ve logvar üretmiş, reparameterization trick kullanılmış ve loss MSE + 1e-4 * KL olarak alınmıştır. SSIM denemesinde loss 0.8*MSE + 0.2*(1-SSIM), L1 denemesinde ise ortalama mutlak hata kullanılmıştır.</w:t>
       </w:r>
     </w:p>
     <w:p>
       <w:pPr>
-        <w:spacing w:after="60" w:line="240" w:lineRule="auto"/>
+        <w:spacing w:after="40" w:line="240" w:lineRule="auto"/>
         <w:jc w:val="both"/>
       </w:pPr>
       <w:r>
@@ -765,7 +765,7 @@
     </w:p>
     <w:p>
       <w:pPr>
-        <w:spacing w:after="60" w:line="240" w:lineRule="auto"/>
+        <w:spacing w:after="40" w:line="240" w:lineRule="auto"/>
         <w:jc w:val="both"/>
       </w:pPr>
       <w:r>
@@ -774,7 +774,7 @@
     </w:p>
     <w:p>
       <w:pPr>
-        <w:spacing w:after="60" w:line="240" w:lineRule="auto"/>
+        <w:spacing w:after="40" w:line="240" w:lineRule="auto"/>
         <w:jc w:val="both"/>
       </w:pPr>
       <w:r>
@@ -783,7 +783,7 @@
     </w:p>
     <w:p>
       <w:pPr>
-        <w:spacing w:after="60" w:line="240" w:lineRule="auto"/>
+        <w:spacing w:after="40" w:line="240" w:lineRule="auto"/>
         <w:jc w:val="both"/>
       </w:pPr>
       <w:r>
@@ -792,13 +792,13 @@
     </w:p>
     <w:p>
       <w:pPr>
-        <w:spacing w:before="60" w:after="40"/>
+        <w:spacing w:before="40" w:after="20"/>
         <w:jc w:val="center"/>
       </w:pPr>
       <w:r>
         <w:rPr>
           <w:b/>
-          <w:sz w:val="20"/>
+          <w:sz w:val="18"/>
         </w:rPr>
         <w:t>Tablo II. Kullanılan veri bölmeleri ve hasta sayıları.</w:t>
       </w:r>
@@ -818,10 +818,10 @@
           <w:insideV w:val="single" w:sz="6" w:space="0" w:color="000000"/>
         </w:tblBorders>
         <w:tblCellMar>
-          <w:top w:w="45" w:type="dxa"/>
-          <w:left w:w="45" w:type="dxa"/>
-          <w:bottom w:w="45" w:type="dxa"/>
-          <w:right w:w="45" w:type="dxa"/>
+          <w:top w:w="30" w:type="dxa"/>
+          <w:left w:w="30" w:type="dxa"/>
+          <w:bottom w:w="30" w:type="dxa"/>
+          <w:right w:w="30" w:type="dxa"/>
         </w:tblCellMar>
       </w:tblPr>
       <w:tblGrid>
@@ -1383,13 +1383,13 @@
     </w:tbl>
     <w:p>
       <w:pPr>
-        <w:spacing w:before="60" w:after="40"/>
+        <w:spacing w:before="40" w:after="20"/>
         <w:jc w:val="center"/>
       </w:pPr>
       <w:r>
         <w:rPr>
           <w:b/>
-          <w:sz w:val="20"/>
+          <w:sz w:val="18"/>
         </w:rPr>
         <w:t>Tablo III. Final ana koşu ve eğitim ayarları.</w:t>
       </w:r>
@@ -1409,10 +1409,10 @@
           <w:insideV w:val="single" w:sz="6" w:space="0" w:color="000000"/>
         </w:tblBorders>
         <w:tblCellMar>
-          <w:top w:w="45" w:type="dxa"/>
-          <w:left w:w="45" w:type="dxa"/>
-          <w:bottom w:w="45" w:type="dxa"/>
-          <w:right w:w="45" w:type="dxa"/>
+          <w:top w:w="30" w:type="dxa"/>
+          <w:left w:w="30" w:type="dxa"/>
+          <w:bottom w:w="30" w:type="dxa"/>
+          <w:right w:w="30" w:type="dxa"/>
         </w:tblCellMar>
       </w:tblPr>
       <w:tblGrid>
@@ -1536,7 +1536,7 @@
                 <w:rFonts w:ascii="Times New Roman" w:hAnsi="Times New Roman"/>
                 <w:sz w:val="16"/>
               </w:rPr>
-              <w:t>ae_mse_l128_e60_plateau</w:t>
+              <w:t>ae_mse_l128_e60_plateau_bn</w:t>
             </w:r>
           </w:p>
         </w:tc>
@@ -1557,7 +1557,7 @@
                 <w:rFonts w:ascii="Times New Roman" w:hAnsi="Times New Roman"/>
                 <w:sz w:val="16"/>
               </w:rPr>
-              <w:t>Giriş</w:t>
+              <w:t>BatchNorm</w:t>
             </w:r>
           </w:p>
         </w:tc>
@@ -1576,7 +1576,7 @@
                 <w:rFonts w:ascii="Times New Roman" w:hAnsi="Times New Roman"/>
                 <w:sz w:val="16"/>
               </w:rPr>
-              <w:t>128x128 gri seviye, [0,1] normalizasyon</w:t>
+              <w:t>encoder ve decoder bloklarında Conv/ConvTranspose sonrası aktif</w:t>
             </w:r>
           </w:p>
         </w:tc>
@@ -1597,7 +1597,7 @@
                 <w:rFonts w:ascii="Times New Roman" w:hAnsi="Times New Roman"/>
                 <w:sz w:val="16"/>
               </w:rPr>
-              <w:t>Latent / batch</w:t>
+              <w:t>Giriş</w:t>
             </w:r>
           </w:p>
         </w:tc>
@@ -1616,7 +1616,7 @@
                 <w:rFonts w:ascii="Times New Roman" w:hAnsi="Times New Roman"/>
                 <w:sz w:val="16"/>
               </w:rPr>
-              <w:t>128 / 32</w:t>
+              <w:t>128x128 gri seviye, [0,1] normalizasyon</w:t>
             </w:r>
           </w:p>
         </w:tc>
@@ -1637,7 +1637,7 @@
                 <w:rFonts w:ascii="Times New Roman" w:hAnsi="Times New Roman"/>
                 <w:sz w:val="16"/>
               </w:rPr>
-              <w:t>Optimizer</w:t>
+              <w:t>Latent / batch</w:t>
             </w:r>
           </w:p>
         </w:tc>
@@ -1656,7 +1656,7 @@
                 <w:rFonts w:ascii="Times New Roman" w:hAnsi="Times New Roman"/>
                 <w:sz w:val="16"/>
               </w:rPr>
-              <w:t>Adam, initial lr=0.001</w:t>
+              <w:t>128 / 32</w:t>
             </w:r>
           </w:p>
         </w:tc>
@@ -1677,7 +1677,7 @@
                 <w:rFonts w:ascii="Times New Roman" w:hAnsi="Times New Roman"/>
                 <w:sz w:val="16"/>
               </w:rPr>
-              <w:t>LR scheduler</w:t>
+              <w:t>Optimizer</w:t>
             </w:r>
           </w:p>
         </w:tc>
@@ -1696,7 +1696,7 @@
                 <w:rFonts w:ascii="Times New Roman" w:hAnsi="Times New Roman"/>
                 <w:sz w:val="16"/>
               </w:rPr>
-              <w:t>plateau, factor=0.5, patience=3, min_lr=1e-05</w:t>
+              <w:t>Adam, initial lr=0.001</w:t>
             </w:r>
           </w:p>
         </w:tc>
@@ -1717,7 +1717,7 @@
                 <w:rFonts w:ascii="Times New Roman" w:hAnsi="Times New Roman"/>
                 <w:sz w:val="16"/>
               </w:rPr>
-              <w:t>Epoch / patience</w:t>
+              <w:t>LR scheduler</w:t>
             </w:r>
           </w:p>
         </w:tc>
@@ -1736,7 +1736,7 @@
                 <w:rFonts w:ascii="Times New Roman" w:hAnsi="Times New Roman"/>
                 <w:sz w:val="16"/>
               </w:rPr>
-              <w:t>60 / 10</w:t>
+              <w:t>plateau, factor=0.5, patience=3, min_lr=1e-05</w:t>
             </w:r>
           </w:p>
         </w:tc>
@@ -1757,7 +1757,7 @@
                 <w:rFonts w:ascii="Times New Roman" w:hAnsi="Times New Roman"/>
                 <w:sz w:val="16"/>
               </w:rPr>
-              <w:t>Ana threshold</w:t>
+              <w:t>Epoch / patience</w:t>
             </w:r>
           </w:p>
         </w:tc>
@@ -1776,7 +1776,7 @@
                 <w:rFonts w:ascii="Times New Roman" w:hAnsi="Times New Roman"/>
                 <w:sz w:val="16"/>
               </w:rPr>
-              <w:t>validation NORMAL dağılımından p95</w:t>
+              <w:t>60 / 10</w:t>
             </w:r>
           </w:p>
         </w:tc>
@@ -1797,6 +1797,46 @@
                 <w:rFonts w:ascii="Times New Roman" w:hAnsi="Times New Roman"/>
                 <w:sz w:val="16"/>
               </w:rPr>
+              <w:t>Ana threshold</w:t>
+            </w:r>
+          </w:p>
+        </w:tc>
+        <w:tc>
+          <w:tcPr>
+            <w:tcW w:type="dxa" w:w="5003"/>
+            <w:vAlign w:val="center"/>
+          </w:tcPr>
+          <w:p>
+            <w:pPr>
+              <w:spacing w:after="0"/>
+              <w:jc w:val="center"/>
+            </w:pPr>
+            <w:r>
+              <w:rPr>
+                <w:rFonts w:ascii="Times New Roman" w:hAnsi="Times New Roman"/>
+                <w:sz w:val="16"/>
+              </w:rPr>
+              <w:t>validation NORMAL dağılımından p95</w:t>
+            </w:r>
+          </w:p>
+        </w:tc>
+      </w:tr>
+      <w:tr>
+        <w:tc>
+          <w:tcPr>
+            <w:tcW w:type="dxa" w:w="5003"/>
+            <w:vAlign w:val="center"/>
+          </w:tcPr>
+          <w:p>
+            <w:pPr>
+              <w:spacing w:after="0"/>
+              <w:jc w:val="center"/>
+            </w:pPr>
+            <w:r>
+              <w:rPr>
+                <w:rFonts w:ascii="Times New Roman" w:hAnsi="Times New Roman"/>
+                <w:sz w:val="16"/>
+              </w:rPr>
               <w:t>Eğitim süresi</w:t>
             </w:r>
           </w:p>
@@ -1816,7 +1856,7 @@
                 <w:rFonts w:ascii="Times New Roman" w:hAnsi="Times New Roman"/>
                 <w:sz w:val="16"/>
               </w:rPr>
-              <w:t>46.9 dakika, best epoch 60</w:t>
+              <w:t>60.5 dakika, best epoch 59</w:t>
             </w:r>
           </w:p>
         </w:tc>
@@ -1870,7 +1910,7 @@
       <w:r>
         <w:drawing>
           <wp:inline xmlns:a="http://schemas.openxmlformats.org/drawingml/2006/main" xmlns:pic="http://schemas.openxmlformats.org/drawingml/2006/picture">
-            <wp:extent cx="2788920" cy="740685"/>
+            <wp:extent cx="2606040" cy="692115"/>
             <wp:docPr id="1" name="Picture 1"/>
             <wp:cNvGraphicFramePr>
               <a:graphicFrameLocks noChangeAspect="1"/>
@@ -1891,7 +1931,7 @@
                   <pic:spPr>
                     <a:xfrm>
                       <a:off x="0" y="0"/>
-                      <a:ext cx="2788920" cy="740685"/>
+                      <a:ext cx="2606040" cy="692115"/>
                     </a:xfrm>
                     <a:prstGeom prst="rect"/>
                   </pic:spPr>
@@ -1904,19 +1944,19 @@
     </w:p>
     <w:p>
       <w:pPr>
-        <w:spacing w:after="60"/>
+        <w:spacing w:after="40"/>
         <w:jc w:val="center"/>
       </w:pPr>
       <w:r>
         <w:rPr>
-          <w:sz w:val="20"/>
+          <w:sz w:val="17"/>
         </w:rPr>
         <w:t>Şekil 1. Önerilen final deney hattı.</w:t>
       </w:r>
     </w:p>
     <w:p>
       <w:pPr>
-        <w:spacing w:before="100" w:after="60"/>
+        <w:spacing w:before="80" w:after="40"/>
         <w:jc w:val="center"/>
       </w:pPr>
       <w:r>
@@ -1930,16 +1970,16 @@
     </w:p>
     <w:p>
       <w:pPr>
-        <w:spacing w:after="60" w:line="240" w:lineRule="auto"/>
+        <w:spacing w:after="40" w:line="240" w:lineRule="auto"/>
         <w:jc w:val="both"/>
       </w:pPr>
       <w:r>
-        <w:t>Tablo IV final aşamasında yapılan ana deneyleri özetlemektedir. Ara baseline olan AE-MSE 40 epoch koşusu AUROC 0.9104 ve F1 0.8262 üretmiştir. Aynı model 60 epoch eğitildiğinde validation loss düşmüş, ancak klasik ortalama MSE score'u tek başına büyük bir sıçrama sağlamamıştır. Son ek denemede ReduceLROnPlateau scheduler kullanılmış; learning rate 36. epoch'ta 1e-3'ten 5e-4'e düşmüş ve best validation loss 60. epoch'ta 0.000669 olmuştur. Scheduler ile eğitilen model ortalama MSE score'unda küçük bir iyileşme üretmiş, asıl iyileşme ise topk_mse_5 score ile gelmiştir: final koşu AUROC 0.9474 ve F1 0.8515 değerine ulaşmıştır. Bu sonuç, OCT patolojilerinin tüm görüntüye yayılmak yerine sınırlı bölgelerde yoğunlaşabildiğini ve ortalama MSE'nin bu sinyali zayıflatabildiğini göstermektedir.</w:t>
+        <w:t>Tablo IV final aşamasında yapılan ana deneyleri özetlemektedir. Ara baseline olan AE-MSE 40 epoch koşusu AUROC 0.9104 ve F1 0.8262 üretmiştir. Aynı model 60 epoch eğitildiğinde validation loss düşmüş, ancak klasik ortalama MSE score'u tek başına büyük bir sıçrama sağlamamıştır. ReduceLROnPlateau scheduler denemesinde learning rate 36. epoch'ta 1e-3'ten 5e-4'e düşmüş ve best validation loss 60. epoch'ta 0.000669 olmuştur. Son BatchNorm denemesinde ise learning rate 44. epoch'ta düşmüş, best validation loss 59. epoch'ta 0.000644 seviyesine inmiştir. BatchNorm ile eğitilen model ortalama MSE score'unda da küçük bir iyileşme üretmiş, asıl iyileşme yine topk_mse_5 score ile gelmiştir: final koşu AUROC 0.9487 ve F1 0.8593 değerine ulaşmıştır. Bu sonuç, OCT patolojilerinin tüm görüntüye yayılmak yerine sınırlı bölgelerde yoğunlaşabildiğini ve ortalama MSE'nin bu sinyali zayıflatabildiğini göstermektedir.</w:t>
       </w:r>
     </w:p>
     <w:p>
       <w:pPr>
-        <w:spacing w:after="60" w:line="240" w:lineRule="auto"/>
+        <w:spacing w:after="40" w:line="240" w:lineRule="auto"/>
         <w:jc w:val="both"/>
       </w:pPr>
       <w:r>
@@ -1948,34 +1988,34 @@
     </w:p>
     <w:p>
       <w:pPr>
-        <w:spacing w:after="60" w:line="240" w:lineRule="auto"/>
+        <w:spacing w:after="40" w:line="240" w:lineRule="auto"/>
         <w:jc w:val="both"/>
       </w:pPr>
       <w:r>
-        <w:t>Score ablation sonuçları, iyileştirmenin model mimarisinden çok hata haritasının nasıl özetlendiğiyle ilişkili olduğunu göstermiştir. Tablo V bu farkı sayısal olarak göstermektedir: scheduler koşusunda topk_mse_5, ortalama MSE'ye göre AUROC değerini 0.9118'den 0.9474'e çıkarmıştır. Sabit learning rate ile 60 epoch eğitilen önceki adayda topk_mse_5 AUROC 0.9457 ve F1 0.8464 üretmişti; scheduler sonrası bu değerler sırasıyla 0.9474 ve 0.8515'e yükselmiştir. Retina-band ve retina-weighted MSE skorları ortalama MSE'ye yakın kalmış, L1/SSIM tabanlı ensemble score'lar ise topk_mse_5'i geçememiştir. Border crop yalnızca önizleme düzeyinde bırakılmıştır; çünkü ilk görsel inceleme bu yaklaşımın sınırlı katkı sağlayacağını göstermiştir. Content crop ve retina-margin crop ise tam eğitimle denenmiş, ancak daha yüksek DRUSEN tespitine rağmen genel ayrımı bozduğu için final seçime alınmamıştır.</w:t>
+        <w:t>Score ablation sonuçları, iyileştirmenin yalnız model mimarisinden değil, hata haritasının nasıl özetlendiğinden de etkilendiğini göstermiştir. Tablo V bu farkı sayısal olarak göstermektedir: BatchNorm + scheduler koşusunda topk_mse_5, ortalama MSE'ye göre AUROC değerini 0.9127'den 0.9487'ye çıkarmıştır. Önceki scheduler adayında topk_mse_5 AUROC 0.9474 ve F1 0.8515 üretmişti; BatchNorm sonrası bu değerler 0.9487 ve 0.8593'e yükselmiştir. Retina-band ve retina-weighted MSE skorları ortalama MSE'ye yakın kalmış, L1/SSIM tabanlı ensemble score'lar ise topk_mse_5'i geçememiştir. Border crop yalnızca önizleme düzeyinde bırakılmıştır; çünkü ilk görsel inceleme bu yaklaşımın sınırlı katkı sağlayacağını göstermiştir. Content crop ve retina-margin crop ise tam eğitimle denenmiş, ancak daha yüksek DRUSEN tespitine rağmen genel ayrımı bozduğu için final seçime alınmamıştır.</w:t>
       </w:r>
     </w:p>
     <w:p>
       <w:pPr>
-        <w:spacing w:after="60" w:line="240" w:lineRule="auto"/>
+        <w:spacing w:after="40" w:line="240" w:lineRule="auto"/>
         <w:jc w:val="both"/>
       </w:pPr>
       <w:r>
-        <w:t>Tablo VI final image-level ve patient-level sonuçlarını bootstrap güven aralıklarıyla birlikte vermektedir. Image-level p95 eşiğinde precision 0.9860 ve FPR 0.0320 elde edilmiştir; yani normal test görüntülerinde yanlış pozitif sayısı 8/250 seviyesinde kalmıştır. Hasta düzeyinde mean aggregation AUROC 0.9516, F1 0.9066, recall 0.8502, precision 0.9711 ve FPR 0.0760 üretmiştir. Confusion matrix düzeyinde image-level değerlendirmede TN=242, FP=8, FN=188 ve TP=562; patient-level değerlendirmede ise TN=158, FP=13, FN=77 ve TP=437 elde edilmiştir. Tablo VII, p95-p97-p99 eşiğinin precision-recall dengesini nasıl değiştirdiğini göstermektedir. p97 ve p99 precision değerini korusa da recall belirgin biçimde düştüğü için final operasyon noktası p95 olarak bırakılmıştır. Tablo VIII, sınıf bazlı davranışı göstermektedir. CNV 248/250, DME 212/250 yakalanırken DRUSEN 102/250 seviyesine çıkmıştır. Bu durum scheduler ve top-k score birleşiminin DRUSEN tarafında küçük bir kazanım sağladığını, ancak DRUSEN'in normal anatomiye yakın ve daha lokal sapmalar içerebildiği için halen en zor sınıf olduğunu göstermektedir. Üretilen heatmap ve DRUSEN false negative görselleri de modelin bazı DRUSEN örneklerinde patolojik bölgeyi yeterince yüksek score'a taşıyamadığını göstermiştir.</w:t>
+        <w:t>Tablo VI final image-level ve patient-level sonuçlarını bootstrap güven aralıklarıyla birlikte vermektedir. Image-level p95 eşiğinde precision 0.9862 ve FPR 0.0320 elde edilmiştir; yani normal test görüntülerinde yanlış pozitif sayısı 8/250 seviyesinde kalmıştır. Hasta düzeyinde mean aggregation AUROC 0.9513, F1 0.9089, recall 0.8541, precision 0.9712 ve FPR 0.0760 üretmiştir. Confusion matrix düzeyinde image-level değerlendirmede TN=242, FP=8, FN=179 ve TP=571; patient-level değerlendirmede ise TN=158, FP=13, FN=75 ve TP=439 elde edilmiştir. Tablo VII, p95-p97-p99 eşiğinin precision-recall dengesini nasıl değiştirdiğini göstermektedir. p97 ve p99 precision değerini korusa da recall belirgin biçimde düştüğü için final operasyon noktası p95 olarak bırakılmıştır. Tablo VIII, sınıf bazlı davranışı göstermektedir. CNV 248/250, DME 216/250 yakalanırken DRUSEN 107/250 seviyesine çıkmıştır. Bu durum BatchNorm, scheduler ve top-k score birleşiminin DRUSEN tarafında küçük ama ölçülebilir bir kazanım sağladığını, ancak DRUSEN'in normal anatomiye yakın ve daha lokal sapmalar içerebildiği için halen en zor sınıf olduğunu göstermektedir. Üretilen heatmap ve DRUSEN false negative görselleri de modelin bazı DRUSEN örneklerinde patolojik bölgeyi yeterince yüksek score'a taşıyamadığını göstermiştir.</w:t>
       </w:r>
     </w:p>
     <w:p>
       <w:pPr>
-        <w:spacing w:after="60" w:line="240" w:lineRule="auto"/>
+        <w:spacing w:after="40" w:line="240" w:lineRule="auto"/>
         <w:jc w:val="both"/>
       </w:pPr>
       <w:r>
-        <w:t>60 epoch ve scheduler denemesi ayrıca eğitim süresi ve overfitting açısından da yorumlanmıştır. En iyi validation loss son epoch'ta görülmüş, bu da 40 epoch sınırının biraz erken kalabileceğini ve learning rate düşüşünün eğitim sonunda hâlâ fayda sağlayabildiğini göstermiştir. Bununla birlikte ortalama MSE score'u yine sınırlı değişmiştir; dolayısıyla ek epoch veya scheduler tek başına yeterli olmamıştır. Final iyileştirme, daha kontrollü learning rate takvimi ile top-k residual score'un birlikte kullanılmasından gelmiştir. Bu gözlem, rekonstrüksiyon tabanlı anomaly detection problemlerinde yalnızca loss düşüşünü izlemek yerine, score fonksiyonunun patolojik sinyali nasıl özetlediğini de ayrıca test etmek gerektiğini göstermektedir.</w:t>
+        <w:t>60 epoch, scheduler ve BatchNorm denemesi ayrıca eğitim süresi ve overfitting açısından da yorumlanmıştır. En iyi validation loss son epochlara yakın görülmüş, bu da 40 epoch sınırının biraz erken kalabileceğini ve learning rate düşüşünün eğitim sonunda hâlâ fayda sağlayabildiğini göstermiştir. Bununla birlikte ortalama MSE score'u yine sınırlı değişmiştir; dolayısıyla ek epoch, scheduler veya BatchNorm tek başına yeterli olmamıştır. Final iyileştirme, daha stabil eğitim ile top-k residual score'un birlikte kullanılmasından gelmiştir. Bu gözlem, rekonstrüksiyon tabanlı anomaly detection problemlerinde yalnızca loss düşüşünü izlemek yerine, score fonksiyonunun patolojik sinyali nasıl özetlediğini de ayrıca test etmek gerektiğini göstermektedir.</w:t>
       </w:r>
     </w:p>
     <w:p>
       <w:pPr>
-        <w:spacing w:after="60" w:line="240" w:lineRule="auto"/>
+        <w:spacing w:after="40" w:line="240" w:lineRule="auto"/>
         <w:jc w:val="both"/>
       </w:pPr>
       <w:r>
@@ -1989,13 +2029,13 @@
     </w:p>
     <w:p>
       <w:pPr>
-        <w:spacing w:before="60" w:after="40"/>
+        <w:spacing w:before="40" w:after="20"/>
         <w:jc w:val="center"/>
       </w:pPr>
       <w:r>
         <w:rPr>
           <w:b/>
-          <w:sz w:val="20"/>
+          <w:sz w:val="18"/>
         </w:rPr>
         <w:t>Tablo IV. Final aşamasında yapılan ana deneyler.</w:t>
       </w:r>
@@ -2015,10 +2055,10 @@
           <w:insideV w:val="single" w:sz="6" w:space="0" w:color="000000"/>
         </w:tblBorders>
         <w:tblCellMar>
-          <w:top w:w="45" w:type="dxa"/>
-          <w:left w:w="45" w:type="dxa"/>
-          <w:bottom w:w="45" w:type="dxa"/>
-          <w:right w:w="45" w:type="dxa"/>
+          <w:top w:w="30" w:type="dxa"/>
+          <w:left w:w="30" w:type="dxa"/>
+          <w:bottom w:w="30" w:type="dxa"/>
+          <w:right w:w="30" w:type="dxa"/>
         </w:tblCellMar>
       </w:tblPr>
       <w:tblGrid>
@@ -2494,7 +2534,7 @@
                 <w:rFonts w:ascii="Times New Roman" w:hAnsi="Times New Roman"/>
                 <w:sz w:val="16"/>
               </w:rPr>
-              <w:t>ReduceLROnPlateau; raw MSE'de küçük artış</w:t>
+              <w:t>Scheduler; raw MSE'de küçük artış</w:t>
             </w:r>
           </w:p>
         </w:tc>
@@ -2610,7 +2650,239 @@
                 <w:rFonts w:ascii="Times New Roman" w:hAnsi="Times New Roman"/>
                 <w:sz w:val="16"/>
               </w:rPr>
-              <w:t>Final aday; DRUSEN 102/250</w:t>
+              <w:t>Önceki final; DRUSEN 102/250</w:t>
+            </w:r>
+          </w:p>
+        </w:tc>
+      </w:tr>
+      <w:tr>
+        <w:tc>
+          <w:tcPr>
+            <w:tcW w:type="dxa" w:w="1668"/>
+            <w:vAlign w:val="center"/>
+          </w:tcPr>
+          <w:p>
+            <w:pPr>
+              <w:spacing w:after="0"/>
+              <w:jc w:val="center"/>
+            </w:pPr>
+            <w:r>
+              <w:rPr>
+                <w:rFonts w:ascii="Times New Roman" w:hAnsi="Times New Roman"/>
+                <w:sz w:val="16"/>
+              </w:rPr>
+              <w:t>AE-MSE LR+BN</w:t>
+            </w:r>
+          </w:p>
+        </w:tc>
+        <w:tc>
+          <w:tcPr>
+            <w:tcW w:type="dxa" w:w="1668"/>
+            <w:vAlign w:val="center"/>
+          </w:tcPr>
+          <w:p>
+            <w:pPr>
+              <w:spacing w:after="0"/>
+              <w:jc w:val="center"/>
+            </w:pPr>
+            <w:r>
+              <w:rPr>
+                <w:rFonts w:ascii="Times New Roman" w:hAnsi="Times New Roman"/>
+                <w:sz w:val="16"/>
+              </w:rPr>
+              <w:t>0.9127</w:t>
+            </w:r>
+          </w:p>
+        </w:tc>
+        <w:tc>
+          <w:tcPr>
+            <w:tcW w:type="dxa" w:w="1668"/>
+            <w:vAlign w:val="center"/>
+          </w:tcPr>
+          <w:p>
+            <w:pPr>
+              <w:spacing w:after="0"/>
+              <w:jc w:val="center"/>
+            </w:pPr>
+            <w:r>
+              <w:rPr>
+                <w:rFonts w:ascii="Times New Roman" w:hAnsi="Times New Roman"/>
+                <w:sz w:val="16"/>
+              </w:rPr>
+              <w:t>0.8384</w:t>
+            </w:r>
+          </w:p>
+        </w:tc>
+        <w:tc>
+          <w:tcPr>
+            <w:tcW w:type="dxa" w:w="1668"/>
+            <w:vAlign w:val="center"/>
+          </w:tcPr>
+          <w:p>
+            <w:pPr>
+              <w:spacing w:after="0"/>
+              <w:jc w:val="center"/>
+            </w:pPr>
+            <w:r>
+              <w:rPr>
+                <w:rFonts w:ascii="Times New Roman" w:hAnsi="Times New Roman"/>
+                <w:sz w:val="16"/>
+              </w:rPr>
+              <w:t>0.7400</w:t>
+            </w:r>
+          </w:p>
+        </w:tc>
+        <w:tc>
+          <w:tcPr>
+            <w:tcW w:type="dxa" w:w="1668"/>
+            <w:vAlign w:val="center"/>
+          </w:tcPr>
+          <w:p>
+            <w:pPr>
+              <w:spacing w:after="0"/>
+              <w:jc w:val="center"/>
+            </w:pPr>
+            <w:r>
+              <w:rPr>
+                <w:rFonts w:ascii="Times New Roman" w:hAnsi="Times New Roman"/>
+                <w:sz w:val="16"/>
+              </w:rPr>
+              <w:t>0.0760</w:t>
+            </w:r>
+          </w:p>
+        </w:tc>
+        <w:tc>
+          <w:tcPr>
+            <w:tcW w:type="dxa" w:w="1668"/>
+            <w:vAlign w:val="center"/>
+          </w:tcPr>
+          <w:p>
+            <w:pPr>
+              <w:spacing w:after="0"/>
+              <w:jc w:val="center"/>
+            </w:pPr>
+            <w:r>
+              <w:rPr>
+                <w:rFonts w:ascii="Times New Roman" w:hAnsi="Times New Roman"/>
+                <w:sz w:val="16"/>
+              </w:rPr>
+              <w:t>BatchNorm; val loss ve raw MSE arttı</w:t>
+            </w:r>
+          </w:p>
+        </w:tc>
+      </w:tr>
+      <w:tr>
+        <w:tc>
+          <w:tcPr>
+            <w:tcW w:type="dxa" w:w="1668"/>
+            <w:vAlign w:val="center"/>
+          </w:tcPr>
+          <w:p>
+            <w:pPr>
+              <w:spacing w:after="0"/>
+              <w:jc w:val="center"/>
+            </w:pPr>
+            <w:r>
+              <w:rPr>
+                <w:rFonts w:ascii="Times New Roman" w:hAnsi="Times New Roman"/>
+                <w:sz w:val="16"/>
+              </w:rPr>
+              <w:t>AE top-k LR+BN</w:t>
+            </w:r>
+          </w:p>
+        </w:tc>
+        <w:tc>
+          <w:tcPr>
+            <w:tcW w:type="dxa" w:w="1668"/>
+            <w:vAlign w:val="center"/>
+          </w:tcPr>
+          <w:p>
+            <w:pPr>
+              <w:spacing w:after="0"/>
+              <w:jc w:val="center"/>
+            </w:pPr>
+            <w:r>
+              <w:rPr>
+                <w:rFonts w:ascii="Times New Roman" w:hAnsi="Times New Roman"/>
+                <w:sz w:val="16"/>
+              </w:rPr>
+              <w:t>0.9487</w:t>
+            </w:r>
+          </w:p>
+        </w:tc>
+        <w:tc>
+          <w:tcPr>
+            <w:tcW w:type="dxa" w:w="1668"/>
+            <w:vAlign w:val="center"/>
+          </w:tcPr>
+          <w:p>
+            <w:pPr>
+              <w:spacing w:after="0"/>
+              <w:jc w:val="center"/>
+            </w:pPr>
+            <w:r>
+              <w:rPr>
+                <w:rFonts w:ascii="Times New Roman" w:hAnsi="Times New Roman"/>
+                <w:sz w:val="16"/>
+              </w:rPr>
+              <w:t>0.8593</w:t>
+            </w:r>
+          </w:p>
+        </w:tc>
+        <w:tc>
+          <w:tcPr>
+            <w:tcW w:type="dxa" w:w="1668"/>
+            <w:vAlign w:val="center"/>
+          </w:tcPr>
+          <w:p>
+            <w:pPr>
+              <w:spacing w:after="0"/>
+              <w:jc w:val="center"/>
+            </w:pPr>
+            <w:r>
+              <w:rPr>
+                <w:rFonts w:ascii="Times New Roman" w:hAnsi="Times New Roman"/>
+                <w:sz w:val="16"/>
+              </w:rPr>
+              <w:t>0.7613</w:t>
+            </w:r>
+          </w:p>
+        </w:tc>
+        <w:tc>
+          <w:tcPr>
+            <w:tcW w:type="dxa" w:w="1668"/>
+            <w:vAlign w:val="center"/>
+          </w:tcPr>
+          <w:p>
+            <w:pPr>
+              <w:spacing w:after="0"/>
+              <w:jc w:val="center"/>
+            </w:pPr>
+            <w:r>
+              <w:rPr>
+                <w:rFonts w:ascii="Times New Roman" w:hAnsi="Times New Roman"/>
+                <w:sz w:val="16"/>
+              </w:rPr>
+              <w:t>0.0320</w:t>
+            </w:r>
+          </w:p>
+        </w:tc>
+        <w:tc>
+          <w:tcPr>
+            <w:tcW w:type="dxa" w:w="1668"/>
+            <w:vAlign w:val="center"/>
+          </w:tcPr>
+          <w:p>
+            <w:pPr>
+              <w:spacing w:after="0"/>
+              <w:jc w:val="center"/>
+            </w:pPr>
+            <w:r>
+              <w:rPr>
+                <w:rFonts w:ascii="Times New Roman" w:hAnsi="Times New Roman"/>
+                <w:sz w:val="16"/>
+              </w:rPr>
+              <w:t>Final aday; DRUSEN 107/250</w:t>
             </w:r>
           </w:p>
         </w:tc>
@@ -3662,13 +3934,13 @@
     </w:tbl>
     <w:p>
       <w:pPr>
-        <w:spacing w:before="60" w:after="40"/>
+        <w:spacing w:before="40" w:after="20"/>
         <w:jc w:val="center"/>
       </w:pPr>
       <w:r>
         <w:rPr>
           <w:b/>
-          <w:sz w:val="20"/>
+          <w:sz w:val="18"/>
         </w:rPr>
         <w:t>Tablo V. Final run için score ablation özeti.</w:t>
       </w:r>
@@ -3688,10 +3960,10 @@
           <w:insideV w:val="single" w:sz="6" w:space="0" w:color="000000"/>
         </w:tblBorders>
         <w:tblCellMar>
-          <w:top w:w="45" w:type="dxa"/>
-          <w:left w:w="45" w:type="dxa"/>
-          <w:bottom w:w="45" w:type="dxa"/>
-          <w:right w:w="45" w:type="dxa"/>
+          <w:top w:w="30" w:type="dxa"/>
+          <w:left w:w="30" w:type="dxa"/>
+          <w:bottom w:w="30" w:type="dxa"/>
+          <w:right w:w="30" w:type="dxa"/>
         </w:tblCellMar>
       </w:tblPr>
       <w:tblGrid>
@@ -3838,7 +4110,7 @@
                 <w:rFonts w:ascii="Times New Roman" w:hAnsi="Times New Roman"/>
                 <w:sz w:val="16"/>
               </w:rPr>
-              <w:t>0.9118</w:t>
+              <w:t>0.9127</w:t>
             </w:r>
           </w:p>
         </w:tc>
@@ -3857,7 +4129,7 @@
                 <w:rFonts w:ascii="Times New Roman" w:hAnsi="Times New Roman"/>
                 <w:sz w:val="16"/>
               </w:rPr>
-              <w:t>0.8317</w:t>
+              <w:t>0.8384</w:t>
             </w:r>
           </w:p>
         </w:tc>
@@ -3876,7 +4148,7 @@
                 <w:rFonts w:ascii="Times New Roman" w:hAnsi="Times New Roman"/>
                 <w:sz w:val="16"/>
               </w:rPr>
-              <w:t>0.7280</w:t>
+              <w:t>0.7400</w:t>
             </w:r>
           </w:p>
         </w:tc>
@@ -3895,7 +4167,7 @@
                 <w:rFonts w:ascii="Times New Roman" w:hAnsi="Times New Roman"/>
                 <w:sz w:val="16"/>
               </w:rPr>
-              <w:t>0.0680</w:t>
+              <w:t>0.0760</w:t>
             </w:r>
           </w:p>
         </w:tc>
@@ -3935,7 +4207,7 @@
                 <w:rFonts w:ascii="Times New Roman" w:hAnsi="Times New Roman"/>
                 <w:sz w:val="16"/>
               </w:rPr>
-              <w:t>0.9139</w:t>
+              <w:t>0.9152</w:t>
             </w:r>
           </w:p>
         </w:tc>
@@ -3954,7 +4226,7 @@
                 <w:rFonts w:ascii="Times New Roman" w:hAnsi="Times New Roman"/>
                 <w:sz w:val="16"/>
               </w:rPr>
-              <w:t>0.8333</w:t>
+              <w:t>0.8444</w:t>
             </w:r>
           </w:p>
         </w:tc>
@@ -3973,7 +4245,7 @@
                 <w:rFonts w:ascii="Times New Roman" w:hAnsi="Times New Roman"/>
                 <w:sz w:val="16"/>
               </w:rPr>
-              <w:t>0.7267</w:t>
+              <w:t>0.7453</w:t>
             </w:r>
           </w:p>
         </w:tc>
@@ -3992,7 +4264,7 @@
                 <w:rFonts w:ascii="Times New Roman" w:hAnsi="Times New Roman"/>
                 <w:sz w:val="16"/>
               </w:rPr>
-              <w:t>0.0520</w:t>
+              <w:t>0.0600</w:t>
             </w:r>
           </w:p>
         </w:tc>
@@ -4032,7 +4304,7 @@
                 <w:rFonts w:ascii="Times New Roman" w:hAnsi="Times New Roman"/>
                 <w:sz w:val="16"/>
               </w:rPr>
-              <w:t>0.9474</w:t>
+              <w:t>0.9487</w:t>
             </w:r>
           </w:p>
         </w:tc>
@@ -4051,7 +4323,7 @@
                 <w:rFonts w:ascii="Times New Roman" w:hAnsi="Times New Roman"/>
                 <w:sz w:val="16"/>
               </w:rPr>
-              <w:t>0.8515</w:t>
+              <w:t>0.8593</w:t>
             </w:r>
           </w:p>
         </w:tc>
@@ -4070,7 +4342,7 @@
                 <w:rFonts w:ascii="Times New Roman" w:hAnsi="Times New Roman"/>
                 <w:sz w:val="16"/>
               </w:rPr>
-              <w:t>0.7493</w:t>
+              <w:t>0.7613</w:t>
             </w:r>
           </w:p>
         </w:tc>
@@ -4129,7 +4401,7 @@
                 <w:rFonts w:ascii="Times New Roman" w:hAnsi="Times New Roman"/>
                 <w:sz w:val="16"/>
               </w:rPr>
-              <w:t>0.9388</w:t>
+              <w:t>0.9395</w:t>
             </w:r>
           </w:p>
         </w:tc>
@@ -4148,7 +4420,7 @@
                 <w:rFonts w:ascii="Times New Roman" w:hAnsi="Times New Roman"/>
                 <w:sz w:val="16"/>
               </w:rPr>
-              <w:t>0.8502</w:t>
+              <w:t>0.8565</w:t>
             </w:r>
           </w:p>
         </w:tc>
@@ -4167,7 +4439,7 @@
                 <w:rFonts w:ascii="Times New Roman" w:hAnsi="Times New Roman"/>
                 <w:sz w:val="16"/>
               </w:rPr>
-              <w:t>0.7493</w:t>
+              <w:t>0.7600</w:t>
             </w:r>
           </w:p>
         </w:tc>
@@ -4186,7 +4458,7 @@
                 <w:rFonts w:ascii="Times New Roman" w:hAnsi="Times New Roman"/>
                 <w:sz w:val="16"/>
               </w:rPr>
-              <w:t>0.0400</w:t>
+              <w:t>0.0440</w:t>
             </w:r>
           </w:p>
         </w:tc>
@@ -4226,7 +4498,7 @@
                 <w:rFonts w:ascii="Times New Roman" w:hAnsi="Times New Roman"/>
                 <w:sz w:val="16"/>
               </w:rPr>
-              <w:t>0.9168</w:t>
+              <w:t>0.9175</w:t>
             </w:r>
           </w:p>
         </w:tc>
@@ -4245,7 +4517,7 @@
                 <w:rFonts w:ascii="Times New Roman" w:hAnsi="Times New Roman"/>
                 <w:sz w:val="16"/>
               </w:rPr>
-              <w:t>0.8449</w:t>
+              <w:t>0.8520</w:t>
             </w:r>
           </w:p>
         </w:tc>
@@ -4264,7 +4536,7 @@
                 <w:rFonts w:ascii="Times New Roman" w:hAnsi="Times New Roman"/>
                 <w:sz w:val="16"/>
               </w:rPr>
-              <w:t>0.7480</w:t>
+              <w:t>0.7600</w:t>
             </w:r>
           </w:p>
         </w:tc>
@@ -4283,7 +4555,7 @@
                 <w:rFonts w:ascii="Times New Roman" w:hAnsi="Times New Roman"/>
                 <w:sz w:val="16"/>
               </w:rPr>
-              <w:t>0.0680</w:t>
+              <w:t>0.0720</w:t>
             </w:r>
           </w:p>
         </w:tc>
@@ -4323,7 +4595,7 @@
                 <w:rFonts w:ascii="Times New Roman" w:hAnsi="Times New Roman"/>
                 <w:sz w:val="16"/>
               </w:rPr>
-              <w:t>0.9114</w:t>
+              <w:t>0.9121</w:t>
             </w:r>
           </w:p>
         </w:tc>
@@ -4342,7 +4614,7 @@
                 <w:rFonts w:ascii="Times New Roman" w:hAnsi="Times New Roman"/>
                 <w:sz w:val="16"/>
               </w:rPr>
-              <w:t>0.8390</w:t>
+              <w:t>0.8503</w:t>
             </w:r>
           </w:p>
         </w:tc>
@@ -4361,7 +4633,7 @@
                 <w:rFonts w:ascii="Times New Roman" w:hAnsi="Times New Roman"/>
                 <w:sz w:val="16"/>
               </w:rPr>
-              <w:t>0.7400</w:t>
+              <w:t>0.7573</w:t>
             </w:r>
           </w:p>
         </w:tc>
@@ -4420,7 +4692,7 @@
                 <w:rFonts w:ascii="Times New Roman" w:hAnsi="Times New Roman"/>
                 <w:sz w:val="16"/>
               </w:rPr>
-              <w:t>0.8482</w:t>
+              <w:t>0.8485</w:t>
             </w:r>
           </w:p>
         </w:tc>
@@ -4439,7 +4711,7 @@
                 <w:rFonts w:ascii="Times New Roman" w:hAnsi="Times New Roman"/>
                 <w:sz w:val="16"/>
               </w:rPr>
-              <w:t>0.7727</w:t>
+              <w:t>0.7692</w:t>
             </w:r>
           </w:p>
         </w:tc>
@@ -4458,7 +4730,7 @@
                 <w:rFonts w:ascii="Times New Roman" w:hAnsi="Times New Roman"/>
                 <w:sz w:val="16"/>
               </w:rPr>
-              <w:t>0.6480</w:t>
+              <w:t>0.6467</w:t>
             </w:r>
           </w:p>
         </w:tc>
@@ -4477,7 +4749,7 @@
                 <w:rFonts w:ascii="Times New Roman" w:hAnsi="Times New Roman"/>
                 <w:sz w:val="16"/>
               </w:rPr>
-              <w:t>0.0880</w:t>
+              <w:t>0.1040</w:t>
             </w:r>
           </w:p>
         </w:tc>
@@ -4517,7 +4789,7 @@
                 <w:rFonts w:ascii="Times New Roman" w:hAnsi="Times New Roman"/>
                 <w:sz w:val="16"/>
               </w:rPr>
-              <w:t>0.7693</w:t>
+              <w:t>0.7689</w:t>
             </w:r>
           </w:p>
         </w:tc>
@@ -4536,7 +4808,7 @@
                 <w:rFonts w:ascii="Times New Roman" w:hAnsi="Times New Roman"/>
                 <w:sz w:val="16"/>
               </w:rPr>
-              <w:t>0.6672</w:t>
+              <w:t>0.6638</w:t>
             </w:r>
           </w:p>
         </w:tc>
@@ -4555,7 +4827,7 @@
                 <w:rFonts w:ascii="Times New Roman" w:hAnsi="Times New Roman"/>
                 <w:sz w:val="16"/>
               </w:rPr>
-              <w:t>0.5240</w:t>
+              <w:t>0.5200</w:t>
             </w:r>
           </w:p>
         </w:tc>
@@ -4582,13 +4854,13 @@
     </w:tbl>
     <w:p>
       <w:pPr>
-        <w:spacing w:before="60" w:after="40"/>
+        <w:spacing w:before="40" w:after="20"/>
         <w:jc w:val="center"/>
       </w:pPr>
       <w:r>
         <w:rPr>
           <w:b/>
-          <w:sz w:val="20"/>
+          <w:sz w:val="18"/>
         </w:rPr>
         <w:t>Tablo VI. Final aday sonuçları ve bootstrap güven aralıkları.</w:t>
       </w:r>
@@ -4608,10 +4880,10 @@
           <w:insideV w:val="single" w:sz="6" w:space="0" w:color="000000"/>
         </w:tblBorders>
         <w:tblCellMar>
-          <w:top w:w="45" w:type="dxa"/>
-          <w:left w:w="45" w:type="dxa"/>
-          <w:bottom w:w="45" w:type="dxa"/>
-          <w:right w:w="45" w:type="dxa"/>
+          <w:top w:w="30" w:type="dxa"/>
+          <w:left w:w="30" w:type="dxa"/>
+          <w:bottom w:w="30" w:type="dxa"/>
+          <w:right w:w="30" w:type="dxa"/>
         </w:tblCellMar>
       </w:tblPr>
       <w:tblGrid>
@@ -4819,7 +5091,7 @@
                 <w:rFonts w:ascii="Times New Roman" w:hAnsi="Times New Roman"/>
                 <w:sz w:val="16"/>
               </w:rPr>
-              <w:t>0.9474 [0.9340-0.9606]</w:t>
+              <w:t>0.9487 [0.9346-0.9617]</w:t>
             </w:r>
           </w:p>
         </w:tc>
@@ -4838,7 +5110,7 @@
                 <w:rFonts w:ascii="Times New Roman" w:hAnsi="Times New Roman"/>
                 <w:sz w:val="16"/>
               </w:rPr>
-              <w:t>0.8515 [0.8297-0.8707]</w:t>
+              <w:t>0.8593 [0.8394-0.8777]</w:t>
             </w:r>
           </w:p>
         </w:tc>
@@ -4857,7 +5129,7 @@
                 <w:rFonts w:ascii="Times New Roman" w:hAnsi="Times New Roman"/>
                 <w:sz w:val="16"/>
               </w:rPr>
-              <w:t>0.7493</w:t>
+              <w:t>0.7613</w:t>
             </w:r>
           </w:p>
         </w:tc>
@@ -4876,7 +5148,7 @@
                 <w:rFonts w:ascii="Times New Roman" w:hAnsi="Times New Roman"/>
                 <w:sz w:val="16"/>
               </w:rPr>
-              <w:t>0.9860</w:t>
+              <w:t>0.9862</w:t>
             </w:r>
           </w:p>
         </w:tc>
@@ -4954,7 +5226,7 @@
                 <w:rFonts w:ascii="Times New Roman" w:hAnsi="Times New Roman"/>
                 <w:sz w:val="16"/>
               </w:rPr>
-              <w:t>0.9516 [0.9332-0.9665]</w:t>
+              <w:t>0.9513 [0.9324-0.9663]</w:t>
             </w:r>
           </w:p>
         </w:tc>
@@ -4973,7 +5245,7 @@
                 <w:rFonts w:ascii="Times New Roman" w:hAnsi="Times New Roman"/>
                 <w:sz w:val="16"/>
               </w:rPr>
-              <w:t>0.9066 [0.8865-0.9243]</w:t>
+              <w:t>0.9089 [0.8903-0.9261]</w:t>
             </w:r>
           </w:p>
         </w:tc>
@@ -4992,7 +5264,7 @@
                 <w:rFonts w:ascii="Times New Roman" w:hAnsi="Times New Roman"/>
                 <w:sz w:val="16"/>
               </w:rPr>
-              <w:t>0.8502</w:t>
+              <w:t>0.8541</w:t>
             </w:r>
           </w:p>
         </w:tc>
@@ -5011,7 +5283,7 @@
                 <w:rFonts w:ascii="Times New Roman" w:hAnsi="Times New Roman"/>
                 <w:sz w:val="16"/>
               </w:rPr>
-              <w:t>0.9711</w:t>
+              <w:t>0.9712</w:t>
             </w:r>
           </w:p>
         </w:tc>
@@ -5043,13 +5315,13 @@
     </w:p>
     <w:p>
       <w:pPr>
-        <w:spacing w:before="60" w:after="40"/>
+        <w:spacing w:before="40" w:after="20"/>
         <w:jc w:val="center"/>
       </w:pPr>
       <w:r>
         <w:rPr>
           <w:b/>
-          <w:sz w:val="20"/>
+          <w:sz w:val="18"/>
         </w:rPr>
         <w:t>Tablo VII. topk_mse_5 için eşik duyarlılığı.</w:t>
       </w:r>
@@ -5069,10 +5341,10 @@
           <w:insideV w:val="single" w:sz="6" w:space="0" w:color="000000"/>
         </w:tblBorders>
         <w:tblCellMar>
-          <w:top w:w="45" w:type="dxa"/>
-          <w:left w:w="45" w:type="dxa"/>
-          <w:bottom w:w="45" w:type="dxa"/>
-          <w:right w:w="45" w:type="dxa"/>
+          <w:top w:w="30" w:type="dxa"/>
+          <w:left w:w="30" w:type="dxa"/>
+          <w:bottom w:w="30" w:type="dxa"/>
+          <w:right w:w="30" w:type="dxa"/>
         </w:tblCellMar>
       </w:tblPr>
       <w:tblGrid>
@@ -5240,64 +5512,64 @@
                 <w:rFonts w:ascii="Times New Roman" w:hAnsi="Times New Roman"/>
                 <w:sz w:val="16"/>
               </w:rPr>
-              <w:t>0.01316</w:t>
-            </w:r>
-          </w:p>
-        </w:tc>
-        <w:tc>
-          <w:tcPr>
-            <w:tcW w:type="dxa" w:w="1668"/>
-            <w:vAlign w:val="center"/>
-          </w:tcPr>
-          <w:p>
-            <w:pPr>
-              <w:spacing w:after="0"/>
-              <w:jc w:val="center"/>
-            </w:pPr>
-            <w:r>
-              <w:rPr>
-                <w:rFonts w:ascii="Times New Roman" w:hAnsi="Times New Roman"/>
-                <w:sz w:val="16"/>
-              </w:rPr>
-              <w:t>0.9860</w:t>
-            </w:r>
-          </w:p>
-        </w:tc>
-        <w:tc>
-          <w:tcPr>
-            <w:tcW w:type="dxa" w:w="1668"/>
-            <w:vAlign w:val="center"/>
-          </w:tcPr>
-          <w:p>
-            <w:pPr>
-              <w:spacing w:after="0"/>
-              <w:jc w:val="center"/>
-            </w:pPr>
-            <w:r>
-              <w:rPr>
-                <w:rFonts w:ascii="Times New Roman" w:hAnsi="Times New Roman"/>
-                <w:sz w:val="16"/>
-              </w:rPr>
-              <w:t>0.7493</w:t>
-            </w:r>
-          </w:p>
-        </w:tc>
-        <w:tc>
-          <w:tcPr>
-            <w:tcW w:type="dxa" w:w="1668"/>
-            <w:vAlign w:val="center"/>
-          </w:tcPr>
-          <w:p>
-            <w:pPr>
-              <w:spacing w:after="0"/>
-              <w:jc w:val="center"/>
-            </w:pPr>
-            <w:r>
-              <w:rPr>
-                <w:rFonts w:ascii="Times New Roman" w:hAnsi="Times New Roman"/>
-                <w:sz w:val="16"/>
-              </w:rPr>
-              <w:t>0.8515</w:t>
+              <w:t>0.01270</w:t>
+            </w:r>
+          </w:p>
+        </w:tc>
+        <w:tc>
+          <w:tcPr>
+            <w:tcW w:type="dxa" w:w="1668"/>
+            <w:vAlign w:val="center"/>
+          </w:tcPr>
+          <w:p>
+            <w:pPr>
+              <w:spacing w:after="0"/>
+              <w:jc w:val="center"/>
+            </w:pPr>
+            <w:r>
+              <w:rPr>
+                <w:rFonts w:ascii="Times New Roman" w:hAnsi="Times New Roman"/>
+                <w:sz w:val="16"/>
+              </w:rPr>
+              <w:t>0.9862</w:t>
+            </w:r>
+          </w:p>
+        </w:tc>
+        <w:tc>
+          <w:tcPr>
+            <w:tcW w:type="dxa" w:w="1668"/>
+            <w:vAlign w:val="center"/>
+          </w:tcPr>
+          <w:p>
+            <w:pPr>
+              <w:spacing w:after="0"/>
+              <w:jc w:val="center"/>
+            </w:pPr>
+            <w:r>
+              <w:rPr>
+                <w:rFonts w:ascii="Times New Roman" w:hAnsi="Times New Roman"/>
+                <w:sz w:val="16"/>
+              </w:rPr>
+              <w:t>0.7613</w:t>
+            </w:r>
+          </w:p>
+        </w:tc>
+        <w:tc>
+          <w:tcPr>
+            <w:tcW w:type="dxa" w:w="1668"/>
+            <w:vAlign w:val="center"/>
+          </w:tcPr>
+          <w:p>
+            <w:pPr>
+              <w:spacing w:after="0"/>
+              <w:jc w:val="center"/>
+            </w:pPr>
+            <w:r>
+              <w:rPr>
+                <w:rFonts w:ascii="Times New Roman" w:hAnsi="Times New Roman"/>
+                <w:sz w:val="16"/>
+              </w:rPr>
+              <w:t>0.8593</w:t>
             </w:r>
           </w:p>
         </w:tc>
@@ -5356,83 +5628,83 @@
                 <w:rFonts w:ascii="Times New Roman" w:hAnsi="Times New Roman"/>
                 <w:sz w:val="16"/>
               </w:rPr>
-              <w:t>0.01536</w:t>
-            </w:r>
-          </w:p>
-        </w:tc>
-        <w:tc>
-          <w:tcPr>
-            <w:tcW w:type="dxa" w:w="1668"/>
-            <w:vAlign w:val="center"/>
-          </w:tcPr>
-          <w:p>
-            <w:pPr>
-              <w:spacing w:after="0"/>
-              <w:jc w:val="center"/>
-            </w:pPr>
-            <w:r>
-              <w:rPr>
-                <w:rFonts w:ascii="Times New Roman" w:hAnsi="Times New Roman"/>
-                <w:sz w:val="16"/>
-              </w:rPr>
-              <w:t>0.9942</w:t>
-            </w:r>
-          </w:p>
-        </w:tc>
-        <w:tc>
-          <w:tcPr>
-            <w:tcW w:type="dxa" w:w="1668"/>
-            <w:vAlign w:val="center"/>
-          </w:tcPr>
-          <w:p>
-            <w:pPr>
-              <w:spacing w:after="0"/>
-              <w:jc w:val="center"/>
-            </w:pPr>
-            <w:r>
-              <w:rPr>
-                <w:rFonts w:ascii="Times New Roman" w:hAnsi="Times New Roman"/>
-                <w:sz w:val="16"/>
-              </w:rPr>
-              <w:t>0.6800</w:t>
-            </w:r>
-          </w:p>
-        </w:tc>
-        <w:tc>
-          <w:tcPr>
-            <w:tcW w:type="dxa" w:w="1668"/>
-            <w:vAlign w:val="center"/>
-          </w:tcPr>
-          <w:p>
-            <w:pPr>
-              <w:spacing w:after="0"/>
-              <w:jc w:val="center"/>
-            </w:pPr>
-            <w:r>
-              <w:rPr>
-                <w:rFonts w:ascii="Times New Roman" w:hAnsi="Times New Roman"/>
-                <w:sz w:val="16"/>
-              </w:rPr>
-              <w:t>0.8076</w:t>
-            </w:r>
-          </w:p>
-        </w:tc>
-        <w:tc>
-          <w:tcPr>
-            <w:tcW w:type="dxa" w:w="1668"/>
-            <w:vAlign w:val="center"/>
-          </w:tcPr>
-          <w:p>
-            <w:pPr>
-              <w:spacing w:after="0"/>
-              <w:jc w:val="center"/>
-            </w:pPr>
-            <w:r>
-              <w:rPr>
-                <w:rFonts w:ascii="Times New Roman" w:hAnsi="Times New Roman"/>
-                <w:sz w:val="16"/>
-              </w:rPr>
-              <w:t>0.0120</w:t>
+              <w:t>0.01463</w:t>
+            </w:r>
+          </w:p>
+        </w:tc>
+        <w:tc>
+          <w:tcPr>
+            <w:tcW w:type="dxa" w:w="1668"/>
+            <w:vAlign w:val="center"/>
+          </w:tcPr>
+          <w:p>
+            <w:pPr>
+              <w:spacing w:after="0"/>
+              <w:jc w:val="center"/>
+            </w:pPr>
+            <w:r>
+              <w:rPr>
+                <w:rFonts w:ascii="Times New Roman" w:hAnsi="Times New Roman"/>
+                <w:sz w:val="16"/>
+              </w:rPr>
+              <w:t>0.9904</w:t>
+            </w:r>
+          </w:p>
+        </w:tc>
+        <w:tc>
+          <w:tcPr>
+            <w:tcW w:type="dxa" w:w="1668"/>
+            <w:vAlign w:val="center"/>
+          </w:tcPr>
+          <w:p>
+            <w:pPr>
+              <w:spacing w:after="0"/>
+              <w:jc w:val="center"/>
+            </w:pPr>
+            <w:r>
+              <w:rPr>
+                <w:rFonts w:ascii="Times New Roman" w:hAnsi="Times New Roman"/>
+                <w:sz w:val="16"/>
+              </w:rPr>
+              <w:t>0.6907</w:t>
+            </w:r>
+          </w:p>
+        </w:tc>
+        <w:tc>
+          <w:tcPr>
+            <w:tcW w:type="dxa" w:w="1668"/>
+            <w:vAlign w:val="center"/>
+          </w:tcPr>
+          <w:p>
+            <w:pPr>
+              <w:spacing w:after="0"/>
+              <w:jc w:val="center"/>
+            </w:pPr>
+            <w:r>
+              <w:rPr>
+                <w:rFonts w:ascii="Times New Roman" w:hAnsi="Times New Roman"/>
+                <w:sz w:val="16"/>
+              </w:rPr>
+              <w:t>0.8138</w:t>
+            </w:r>
+          </w:p>
+        </w:tc>
+        <w:tc>
+          <w:tcPr>
+            <w:tcW w:type="dxa" w:w="1668"/>
+            <w:vAlign w:val="center"/>
+          </w:tcPr>
+          <w:p>
+            <w:pPr>
+              <w:spacing w:after="0"/>
+              <w:jc w:val="center"/>
+            </w:pPr>
+            <w:r>
+              <w:rPr>
+                <w:rFonts w:ascii="Times New Roman" w:hAnsi="Times New Roman"/>
+                <w:sz w:val="16"/>
+              </w:rPr>
+              <w:t>0.0200</w:t>
             </w:r>
           </w:p>
         </w:tc>
@@ -5472,64 +5744,64 @@
                 <w:rFonts w:ascii="Times New Roman" w:hAnsi="Times New Roman"/>
                 <w:sz w:val="16"/>
               </w:rPr>
-              <w:t>0.02176</w:t>
-            </w:r>
-          </w:p>
-        </w:tc>
-        <w:tc>
-          <w:tcPr>
-            <w:tcW w:type="dxa" w:w="1668"/>
-            <w:vAlign w:val="center"/>
-          </w:tcPr>
-          <w:p>
-            <w:pPr>
-              <w:spacing w:after="0"/>
-              <w:jc w:val="center"/>
-            </w:pPr>
-            <w:r>
-              <w:rPr>
-                <w:rFonts w:ascii="Times New Roman" w:hAnsi="Times New Roman"/>
-                <w:sz w:val="16"/>
-              </w:rPr>
-              <w:t>0.9947</w:t>
-            </w:r>
-          </w:p>
-        </w:tc>
-        <w:tc>
-          <w:tcPr>
-            <w:tcW w:type="dxa" w:w="1668"/>
-            <w:vAlign w:val="center"/>
-          </w:tcPr>
-          <w:p>
-            <w:pPr>
-              <w:spacing w:after="0"/>
-              <w:jc w:val="center"/>
-            </w:pPr>
-            <w:r>
-              <w:rPr>
-                <w:rFonts w:ascii="Times New Roman" w:hAnsi="Times New Roman"/>
-                <w:sz w:val="16"/>
-              </w:rPr>
-              <w:t>0.5013</w:t>
-            </w:r>
-          </w:p>
-        </w:tc>
-        <w:tc>
-          <w:tcPr>
-            <w:tcW w:type="dxa" w:w="1668"/>
-            <w:vAlign w:val="center"/>
-          </w:tcPr>
-          <w:p>
-            <w:pPr>
-              <w:spacing w:after="0"/>
-              <w:jc w:val="center"/>
-            </w:pPr>
-            <w:r>
-              <w:rPr>
-                <w:rFonts w:ascii="Times New Roman" w:hAnsi="Times New Roman"/>
-                <w:sz w:val="16"/>
-              </w:rPr>
-              <w:t>0.6667</w:t>
+              <w:t>0.02044</w:t>
+            </w:r>
+          </w:p>
+        </w:tc>
+        <w:tc>
+          <w:tcPr>
+            <w:tcW w:type="dxa" w:w="1668"/>
+            <w:vAlign w:val="center"/>
+          </w:tcPr>
+          <w:p>
+            <w:pPr>
+              <w:spacing w:after="0"/>
+              <w:jc w:val="center"/>
+            </w:pPr>
+            <w:r>
+              <w:rPr>
+                <w:rFonts w:ascii="Times New Roman" w:hAnsi="Times New Roman"/>
+                <w:sz w:val="16"/>
+              </w:rPr>
+              <w:t>0.9949</w:t>
+            </w:r>
+          </w:p>
+        </w:tc>
+        <w:tc>
+          <w:tcPr>
+            <w:tcW w:type="dxa" w:w="1668"/>
+            <w:vAlign w:val="center"/>
+          </w:tcPr>
+          <w:p>
+            <w:pPr>
+              <w:spacing w:after="0"/>
+              <w:jc w:val="center"/>
+            </w:pPr>
+            <w:r>
+              <w:rPr>
+                <w:rFonts w:ascii="Times New Roman" w:hAnsi="Times New Roman"/>
+                <w:sz w:val="16"/>
+              </w:rPr>
+              <w:t>0.5240</w:t>
+            </w:r>
+          </w:p>
+        </w:tc>
+        <w:tc>
+          <w:tcPr>
+            <w:tcW w:type="dxa" w:w="1668"/>
+            <w:vAlign w:val="center"/>
+          </w:tcPr>
+          <w:p>
+            <w:pPr>
+              <w:spacing w:after="0"/>
+              <w:jc w:val="center"/>
+            </w:pPr>
+            <w:r>
+              <w:rPr>
+                <w:rFonts w:ascii="Times New Roman" w:hAnsi="Times New Roman"/>
+                <w:sz w:val="16"/>
+              </w:rPr>
+              <w:t>0.6865</w:t>
             </w:r>
           </w:p>
         </w:tc>
@@ -5556,13 +5828,13 @@
     </w:tbl>
     <w:p>
       <w:pPr>
-        <w:spacing w:before="60" w:after="40"/>
+        <w:spacing w:before="40" w:after="20"/>
         <w:jc w:val="center"/>
       </w:pPr>
       <w:r>
         <w:rPr>
           <w:b/>
-          <w:sz w:val="20"/>
+          <w:sz w:val="18"/>
         </w:rPr>
         <w:t>Tablo VIII. Final top-k score için sınıf bazlı tespit özeti.</w:t>
       </w:r>
@@ -5582,10 +5854,10 @@
           <w:insideV w:val="single" w:sz="6" w:space="0" w:color="000000"/>
         </w:tblBorders>
         <w:tblCellMar>
-          <w:top w:w="45" w:type="dxa"/>
-          <w:left w:w="45" w:type="dxa"/>
-          <w:bottom w:w="45" w:type="dxa"/>
-          <w:right w:w="45" w:type="dxa"/>
+          <w:top w:w="30" w:type="dxa"/>
+          <w:left w:w="30" w:type="dxa"/>
+          <w:bottom w:w="30" w:type="dxa"/>
+          <w:right w:w="30" w:type="dxa"/>
         </w:tblCellMar>
       </w:tblPr>
       <w:tblGrid>
@@ -5711,7 +5983,7 @@
                 <w:rFonts w:ascii="Times New Roman" w:hAnsi="Times New Roman"/>
                 <w:sz w:val="16"/>
               </w:rPr>
-              <w:t>0.0338</w:t>
+              <w:t>0.0334</w:t>
             </w:r>
           </w:p>
         </w:tc>
@@ -5808,7 +6080,7 @@
                 <w:rFonts w:ascii="Times New Roman" w:hAnsi="Times New Roman"/>
                 <w:sz w:val="16"/>
               </w:rPr>
-              <w:t>212/250</w:t>
+              <w:t>216/250</w:t>
             </w:r>
           </w:p>
         </w:tc>
@@ -5827,7 +6099,7 @@
                 <w:rFonts w:ascii="Times New Roman" w:hAnsi="Times New Roman"/>
                 <w:sz w:val="16"/>
               </w:rPr>
-              <w:t>0.8480</w:t>
+              <w:t>0.8640</w:t>
             </w:r>
           </w:p>
         </w:tc>
@@ -5867,7 +6139,7 @@
                 <w:rFonts w:ascii="Times New Roman" w:hAnsi="Times New Roman"/>
                 <w:sz w:val="16"/>
               </w:rPr>
-              <w:t>0.0143</w:t>
+              <w:t>0.0137</w:t>
             </w:r>
           </w:p>
         </w:tc>
@@ -5886,7 +6158,7 @@
                 <w:rFonts w:ascii="Times New Roman" w:hAnsi="Times New Roman"/>
                 <w:sz w:val="16"/>
               </w:rPr>
-              <w:t>102/250</w:t>
+              <w:t>107/250</w:t>
             </w:r>
           </w:p>
         </w:tc>
@@ -5905,7 +6177,7 @@
                 <w:rFonts w:ascii="Times New Roman" w:hAnsi="Times New Roman"/>
                 <w:sz w:val="16"/>
               </w:rPr>
-              <w:t>0.4080</w:t>
+              <w:t>0.4280</w:t>
             </w:r>
           </w:p>
         </w:tc>
@@ -5945,7 +6217,7 @@
                 <w:rFonts w:ascii="Times New Roman" w:hAnsi="Times New Roman"/>
                 <w:sz w:val="16"/>
               </w:rPr>
-              <w:t>0.0075</w:t>
+              <w:t>0.0072</w:t>
             </w:r>
           </w:p>
         </w:tc>
@@ -5991,7 +6263,7 @@
     </w:tbl>
     <w:p>
       <w:pPr>
-        <w:spacing w:after="60" w:line="240" w:lineRule="auto"/>
+        <w:spacing w:after="40" w:line="240" w:lineRule="auto"/>
         <w:jc w:val="both"/>
       </w:pPr>
       <w:r>
@@ -6000,7 +6272,7 @@
     </w:p>
     <w:p>
       <w:pPr>
-        <w:spacing w:after="60" w:line="240" w:lineRule="auto"/>
+        <w:spacing w:after="40" w:line="240" w:lineRule="auto"/>
         <w:jc w:val="both"/>
       </w:pPr>
       <w:r>
@@ -6009,7 +6281,7 @@
     </w:p>
     <w:p>
       <w:pPr>
-        <w:spacing w:after="60" w:line="240" w:lineRule="auto"/>
+        <w:spacing w:after="40" w:line="240" w:lineRule="auto"/>
         <w:jc w:val="both"/>
       </w:pPr>
       <w:r>
@@ -6024,7 +6296,7 @@
       <w:r>
         <w:drawing>
           <wp:inline xmlns:a="http://schemas.openxmlformats.org/drawingml/2006/main" xmlns:pic="http://schemas.openxmlformats.org/drawingml/2006/picture">
-            <wp:extent cx="2788920" cy="1001922"/>
+            <wp:extent cx="2606040" cy="936222"/>
             <wp:docPr id="2" name="Picture 2"/>
             <wp:cNvGraphicFramePr>
               <a:graphicFrameLocks noChangeAspect="1"/>
@@ -6045,7 +6317,7 @@
                   <pic:spPr>
                     <a:xfrm>
                       <a:off x="0" y="0"/>
-                      <a:ext cx="2788920" cy="1001922"/>
+                      <a:ext cx="2606040" cy="936222"/>
                     </a:xfrm>
                     <a:prstGeom prst="rect"/>
                   </pic:spPr>
@@ -6058,12 +6330,12 @@
     </w:p>
     <w:p>
       <w:pPr>
-        <w:spacing w:after="60"/>
+        <w:spacing w:after="40"/>
         <w:jc w:val="center"/>
       </w:pPr>
       <w:r>
         <w:rPr>
-          <w:sz w:val="20"/>
+          <w:sz w:val="17"/>
         </w:rPr>
         <w:t>Şekil 2. Final performans ve sınıf bazlı tespit özeti.</w:t>
       </w:r>
@@ -6076,7 +6348,7 @@
       <w:r>
         <w:drawing>
           <wp:inline xmlns:a="http://schemas.openxmlformats.org/drawingml/2006/main" xmlns:pic="http://schemas.openxmlformats.org/drawingml/2006/picture">
-            <wp:extent cx="2788920" cy="3625596"/>
+            <wp:extent cx="2331720" cy="3031236"/>
             <wp:docPr id="3" name="Picture 3"/>
             <wp:cNvGraphicFramePr>
               <a:graphicFrameLocks noChangeAspect="1"/>
@@ -6097,7 +6369,7 @@
                   <pic:spPr>
                     <a:xfrm>
                       <a:off x="0" y="0"/>
-                      <a:ext cx="2788920" cy="3625596"/>
+                      <a:ext cx="2331720" cy="3031236"/>
                     </a:xfrm>
                     <a:prstGeom prst="rect"/>
                   </pic:spPr>
@@ -6110,12 +6382,12 @@
     </w:p>
     <w:p>
       <w:pPr>
-        <w:spacing w:after="60"/>
+        <w:spacing w:after="40"/>
         <w:jc w:val="center"/>
       </w:pPr>
       <w:r>
         <w:rPr>
-          <w:sz w:val="20"/>
+          <w:sz w:val="17"/>
         </w:rPr>
         <w:t>Şekil 3. Top-k residual overlay ile nitel analiz örnekleri.</w:t>
       </w:r>
@@ -6128,7 +6400,7 @@
       <w:r>
         <w:drawing>
           <wp:inline xmlns:a="http://schemas.openxmlformats.org/drawingml/2006/main" xmlns:pic="http://schemas.openxmlformats.org/drawingml/2006/picture">
-            <wp:extent cx="2788920" cy="3625596"/>
+            <wp:extent cx="2331720" cy="3031236"/>
             <wp:docPr id="4" name="Picture 4"/>
             <wp:cNvGraphicFramePr>
               <a:graphicFrameLocks noChangeAspect="1"/>
@@ -6149,7 +6421,7 @@
                   <pic:spPr>
                     <a:xfrm>
                       <a:off x="0" y="0"/>
-                      <a:ext cx="2788920" cy="3625596"/>
+                      <a:ext cx="2331720" cy="3031236"/>
                     </a:xfrm>
                     <a:prstGeom prst="rect"/>
                   </pic:spPr>
@@ -6162,19 +6434,19 @@
     </w:p>
     <w:p>
       <w:pPr>
-        <w:spacing w:after="60"/>
+        <w:spacing w:after="40"/>
         <w:jc w:val="center"/>
       </w:pPr>
       <w:r>
         <w:rPr>
-          <w:sz w:val="20"/>
+          <w:sz w:val="17"/>
         </w:rPr>
         <w:t>Şekil 4. DRUSEN false negative örnekleri.</w:t>
       </w:r>
     </w:p>
     <w:p>
       <w:pPr>
-        <w:spacing w:before="100" w:after="60"/>
+        <w:spacing w:before="80" w:after="40"/>
         <w:jc w:val="center"/>
       </w:pPr>
       <w:r>
@@ -6188,25 +6460,25 @@
     </w:p>
     <w:p>
       <w:pPr>
-        <w:spacing w:after="60" w:line="240" w:lineRule="auto"/>
+        <w:spacing w:after="40" w:line="240" w:lineRule="auto"/>
         <w:jc w:val="both"/>
       </w:pPr>
       <w:r>
-        <w:t>Bu projede normal retina OCT görüntülerinden öğrenen konvolüsyonel autoencoder tabanlı bir anomali tespit sistemi uçtan uca geliştirilmiş ve final aşamasında kapsamlı ablasyonlarla değerlendirilmiştir. En güçlü sonuç, yeni ve daha karmaşık bir modelden değil, aynı AE-MSE modelinin ReduceLROnPlateau ile daha kontrollü eğitilip lokal hataya duyarlı top-k residual score ile değerlendirilmesinden gelmiştir. Final image-level sonuç AUROC 0.9474 ve F1 0.8515, hasta düzeyi sonuç ise AUROC 0.9516 ve F1 0.9066'dır.</w:t>
+        <w:t>Bu projede normal retina OCT görüntülerinden öğrenen konvolüsyonel autoencoder tabanlı bir anomali tespit sistemi uçtan uca geliştirilmiş ve final aşamasında kapsamlı ablasyonlarla değerlendirilmiştir. En güçlü sonuç, yeni ve çok daha karmaşık bir modelden değil, aynı AE-MSE modelinin BatchNorm ve ReduceLROnPlateau ile daha stabil eğitilip lokal hataya duyarlı top-k residual score ile değerlendirilmesinden gelmiştir. Final image-level sonuç AUROC 0.9487 ve F1 0.8593, hasta düzeyi sonuç ise AUROC 0.9513 ve F1 0.9089'dır.</w:t>
       </w:r>
     </w:p>
     <w:p>
       <w:pPr>
-        <w:spacing w:after="60" w:line="240" w:lineRule="auto"/>
+        <w:spacing w:after="40" w:line="240" w:lineRule="auto"/>
         <w:jc w:val="both"/>
       </w:pPr>
       <w:r>
-        <w:t>Deneyler VAE, L1, MSE+SSIM, latent boyut, batch size ve crop gibi seçeneklerin bu veri ve ayarlarda her zaman iyileştirme getirmediğini göstermiştir. Özellikle crop işlemleri DRUSEN yakalamayı artırsa bile genel hata dengesini bozmuştur. Çalışmanın ana sınırlılıkları, test setinin sınıf başına 250 görüntüyle sınırlı tutulması, pixel-level lezyon anotasyonu bulunmaması ve modelin klinik karar destek sistemi olarak kullanılmaya hazır olmamasıdır. Bu nedenle geliştirilen sistem klinik tanı verme amacıyla değil, ders kapsamında değerlendirilen akademik bir anomaly detection baseline olarak ele alınmalıdır. Buna rağmen hasta bazlı split, testten bağımsız threshold seçimi, bootstrap güven aralığı ve nitel residual analizleriyle proje, final teslimi için tutarlı ve tekrar üretilebilir bir normal-only OCT anomaly detection baseline sunmaktadır.</w:t>
+        <w:t>Deneyler VAE, L1, MSE+SSIM, latent boyut, batch size ve crop gibi seçeneklerin bu veri ve ayarlarda her zaman iyileştirme getirmediğini göstermiştir. BatchNorm ise validation loss, image-level F1 ve DRUSEN tespit sayısında küçük ama tutarlı bir artış sağlamıştır. Özellikle crop işlemleri DRUSEN yakalamayı artırsa bile genel hata dengesini bozmuştur. Çalışmanın ana sınırlılıkları, test setinin sınıf başına 250 görüntüyle sınırlı tutulması, pixel-level lezyon anotasyonu bulunmaması ve modelin klinik karar destek sistemi olarak kullanılmaya hazır olmamasıdır. Bu nedenle geliştirilen sistem klinik tanı verme amacıyla değil, ders kapsamında değerlendirilen akademik bir anomaly detection baseline olarak ele alınmalıdır. Buna rağmen hasta bazlı split, testten bağımsız threshold seçimi, bootstrap güven aralığı ve nitel residual analizleriyle proje, final teslimi için tutarlı ve tekrar üretilebilir bir normal-only OCT anomaly detection baseline sunmaktadır.</w:t>
       </w:r>
     </w:p>
     <w:p>
       <w:pPr>
-        <w:spacing w:after="60" w:line="240" w:lineRule="auto"/>
+        <w:spacing w:after="40" w:line="240" w:lineRule="auto"/>
         <w:jc w:val="both"/>
       </w:pPr>
       <w:r>
@@ -6215,7 +6487,7 @@
     </w:p>
     <w:p>
       <w:pPr>
-        <w:spacing w:after="60" w:line="240" w:lineRule="auto"/>
+        <w:spacing w:after="40" w:line="240" w:lineRule="auto"/>
         <w:jc w:val="both"/>
       </w:pPr>
       <w:r>
@@ -6224,7 +6496,7 @@
     </w:p>
     <w:p>
       <w:pPr>
-        <w:spacing w:after="60" w:line="240" w:lineRule="auto"/>
+        <w:spacing w:after="40" w:line="240" w:lineRule="auto"/>
         <w:jc w:val="both"/>
       </w:pPr>
       <w:r>
@@ -6233,7 +6505,7 @@
     </w:p>
     <w:p>
       <w:pPr>
-        <w:spacing w:before="100" w:after="60"/>
+        <w:spacing w:before="80" w:after="40"/>
         <w:jc w:val="center"/>
       </w:pPr>
       <w:r>
@@ -6247,156 +6519,156 @@
     </w:p>
     <w:p>
       <w:pPr>
-        <w:spacing w:after="20" w:line="240" w:lineRule="auto"/>
+        <w:spacing w:after="0" w:line="221" w:lineRule="auto"/>
         <w:jc w:val="left"/>
       </w:pPr>
       <w:r>
         <w:rPr>
           <w:rFonts w:ascii="Times New Roman" w:hAnsi="Times New Roman"/>
-          <w:sz w:val="16"/>
+          <w:sz w:val="14"/>
         </w:rPr>
         <w:t>[1] D. S. Kermany et al., "Identifying medical diagnoses and treatable diseases by image-based deep learning," Cell, vol. 172, no. 5, pp. 1122-1131.e9, 2018, doi: 10.1016/j.cell.2018.02.010.</w:t>
       </w:r>
     </w:p>
     <w:p>
       <w:pPr>
-        <w:spacing w:after="20" w:line="240" w:lineRule="auto"/>
+        <w:spacing w:after="0" w:line="221" w:lineRule="auto"/>
         <w:jc w:val="left"/>
       </w:pPr>
       <w:r>
         <w:rPr>
           <w:rFonts w:ascii="Times New Roman" w:hAnsi="Times New Roman"/>
-          <w:sz w:val="16"/>
+          <w:sz w:val="14"/>
         </w:rPr>
         <w:t>[2] D. S. Kermany, K. Zhang, and M. Goldbaum, "Large dataset of labeled optical coherence tomography (OCT) and chest X-ray images," Mendeley Data, ver. 3, 2018, doi: 10.17632/rscbjbr9sj.3.</w:t>
       </w:r>
     </w:p>
     <w:p>
       <w:pPr>
-        <w:spacing w:after="20" w:line="240" w:lineRule="auto"/>
+        <w:spacing w:after="0" w:line="221" w:lineRule="auto"/>
         <w:jc w:val="left"/>
       </w:pPr>
       <w:r>
         <w:rPr>
           <w:rFonts w:ascii="Times New Roman" w:hAnsi="Times New Roman"/>
-          <w:sz w:val="16"/>
+          <w:sz w:val="14"/>
         </w:rPr>
         <w:t>[3] G. Litjens et al., "A survey on deep learning in medical image analysis," Med. Image Anal., vol. 42, pp. 60-88, 2017, doi: 10.1016/j.media.2017.07.005.</w:t>
       </w:r>
     </w:p>
     <w:p>
       <w:pPr>
-        <w:spacing w:after="20" w:line="240" w:lineRule="auto"/>
+        <w:spacing w:after="0" w:line="221" w:lineRule="auto"/>
         <w:jc w:val="left"/>
       </w:pPr>
       <w:r>
         <w:rPr>
           <w:rFonts w:ascii="Times New Roman" w:hAnsi="Times New Roman"/>
-          <w:sz w:val="16"/>
+          <w:sz w:val="14"/>
         </w:rPr>
         <w:t>[4] D. P. Kingma and M. Welling, "Auto-Encoding Variational Bayes," arXiv:1312.6114, 2013.</w:t>
       </w:r>
     </w:p>
     <w:p>
       <w:pPr>
-        <w:spacing w:after="20" w:line="240" w:lineRule="auto"/>
+        <w:spacing w:after="0" w:line="221" w:lineRule="auto"/>
         <w:jc w:val="left"/>
       </w:pPr>
       <w:r>
         <w:rPr>
           <w:rFonts w:ascii="Times New Roman" w:hAnsi="Times New Roman"/>
-          <w:sz w:val="16"/>
+          <w:sz w:val="14"/>
         </w:rPr>
         <w:t>[5] Z. Wang, A. C. Bovik, H. R. Sheikh, and E. P. Simoncelli, "Image quality assessment: From error visibility to structural similarity," IEEE Trans. Image Process., vol. 13, no. 4, pp. 600-612, 2004, doi: 10.1109/TIP.2003.819861.</w:t>
       </w:r>
     </w:p>
     <w:p>
       <w:pPr>
-        <w:spacing w:after="20" w:line="240" w:lineRule="auto"/>
+        <w:spacing w:after="0" w:line="221" w:lineRule="auto"/>
         <w:jc w:val="left"/>
       </w:pPr>
       <w:r>
         <w:rPr>
           <w:rFonts w:ascii="Times New Roman" w:hAnsi="Times New Roman"/>
-          <w:sz w:val="16"/>
+          <w:sz w:val="14"/>
         </w:rPr>
         <w:t>[6] T. Schlegl, P. Seebock, S. M. Waldstein, U. Schmidt-Erfurth, and G. Langs, "Unsupervised anomaly detection with generative adversarial networks to guide marker discovery," arXiv:1703.05921, 2017, doi: 10.48550/arXiv.1703.05921.</w:t>
       </w:r>
     </w:p>
     <w:p>
       <w:pPr>
-        <w:spacing w:after="20" w:line="240" w:lineRule="auto"/>
+        <w:spacing w:after="0" w:line="221" w:lineRule="auto"/>
         <w:jc w:val="left"/>
       </w:pPr>
       <w:r>
         <w:rPr>
           <w:rFonts w:ascii="Times New Roman" w:hAnsi="Times New Roman"/>
-          <w:sz w:val="16"/>
+          <w:sz w:val="14"/>
         </w:rPr>
         <w:t>[7] S. Akcay, A. Atapour-Abarghouei, and T. P. Breckon, "GANomaly: Semi-supervised anomaly detection via adversarial training," in Proc. Asian Conf. Comput. Vis. (ACCV), pp. 622-637, 2018, doi: 10.1007/978-3-030-20893-6_39.</w:t>
       </w:r>
     </w:p>
     <w:p>
       <w:pPr>
-        <w:spacing w:after="20" w:line="240" w:lineRule="auto"/>
+        <w:spacing w:after="0" w:line="221" w:lineRule="auto"/>
         <w:jc w:val="left"/>
       </w:pPr>
       <w:r>
         <w:rPr>
           <w:rFonts w:ascii="Times New Roman" w:hAnsi="Times New Roman"/>
-          <w:sz w:val="16"/>
+          <w:sz w:val="14"/>
         </w:rPr>
         <w:t>[8] V. Zavrtanik, M. Kristan, and D. Skocaj, "DRAEM - A discriminatively trained reconstruction embedding for surface anomaly detection," in Proc. IEEE/CVF Int. Conf. Comput. Vis. (ICCV), pp. 8330-8339, 2021.</w:t>
       </w:r>
     </w:p>
     <w:p>
       <w:pPr>
-        <w:spacing w:after="20" w:line="240" w:lineRule="auto"/>
+        <w:spacing w:after="0" w:line="221" w:lineRule="auto"/>
         <w:jc w:val="left"/>
       </w:pPr>
       <w:r>
         <w:rPr>
           <w:rFonts w:ascii="Times New Roman" w:hAnsi="Times New Roman"/>
-          <w:sz w:val="16"/>
+          <w:sz w:val="14"/>
         </w:rPr>
         <w:t>[9] P. Seebock et al., "Exploiting epistemic uncertainty of anatomy segmentation for anomaly detection in retinal OCT," IEEE Trans. Med. Imaging, vol. 39, no. 1, pp. 87-98, 2020, doi: 10.1109/TMI.2019.2919951.</w:t>
       </w:r>
     </w:p>
     <w:p>
       <w:pPr>
-        <w:spacing w:after="20" w:line="240" w:lineRule="auto"/>
+        <w:spacing w:after="0" w:line="221" w:lineRule="auto"/>
         <w:jc w:val="left"/>
       </w:pPr>
       <w:r>
         <w:rPr>
           <w:rFonts w:ascii="Times New Roman" w:hAnsi="Times New Roman"/>
-          <w:sz w:val="16"/>
+          <w:sz w:val="14"/>
         </w:rPr>
         <w:t>[10] K. Zhou et al., "Proxy-bridged image reconstruction network for anomaly detection in medical images," IEEE Trans. Med. Imaging, vol. 41, no. 3, pp. 582-594, 2022, doi: 10.1109/TMI.2021.3118223.</w:t>
       </w:r>
     </w:p>
     <w:p>
       <w:pPr>
-        <w:spacing w:after="20" w:line="240" w:lineRule="auto"/>
+        <w:spacing w:after="0" w:line="221" w:lineRule="auto"/>
         <w:jc w:val="left"/>
       </w:pPr>
       <w:r>
         <w:rPr>
           <w:rFonts w:ascii="Times New Roman" w:hAnsi="Times New Roman"/>
-          <w:sz w:val="16"/>
+          <w:sz w:val="14"/>
         </w:rPr>
         <w:t>[11] Y. Luo, Y. Ma, and Z. Yang, "Multi-resolution auto-encoder for anomaly detection of retinal imaging," Phys. Eng. Sci. Med., vol. 47, no. 2, pp. 517-529, 2024, doi: 10.1007/s13246-023-01381-x.</w:t>
       </w:r>
     </w:p>
     <w:p>
       <w:pPr>
-        <w:spacing w:after="20" w:line="240" w:lineRule="auto"/>
+        <w:spacing w:after="0" w:line="221" w:lineRule="auto"/>
         <w:jc w:val="left"/>
       </w:pPr>
       <w:r>
         <w:rPr>
           <w:rFonts w:ascii="Times New Roman" w:hAnsi="Times New Roman"/>
-          <w:sz w:val="16"/>
+          <w:sz w:val="14"/>
         </w:rPr>
         <w:t>[12] J. Wang, W. Li, Y. Chen, et al., "Weakly supervised anomaly segmentation in retinal OCT images using an adversarial learning approach," Biomed. Opt. Express, vol. 12, no. 8, pp. 4713-4729, 2021, doi: 10.1364/BOE.426803.</w:t>
       </w:r>

</xml_diff>

<commit_message>
Clean report folder and final project artifacts
</commit_message>
<xml_diff>
--- a/report/Grup12_KorayÖztürk_EmirAlpİlhan_Final_Rapor.docx
+++ b/report/Grup12_KorayÖztürk_EmirAlpİlhan_Final_Rapor.docx
@@ -217,7 +217,7 @@
         <w:t xml:space="preserve">Özet - </w:t>
       </w:r>
       <w:r>
-        <w:t>Bu çalışmada retinal OCT görüntülerinde patolojik örneklerin tespiti için yalnızca normal görüntülerle eğitilen konvolüsyonel autoencoder tabanlı bir anomali tespit hattı geliştirilmiştir. Kermany OCT2017/Mendeley veri kümesinde eğitim aşamasına sadece NORMAL sınıfı alınmış, doğrulama bölmesi hasta kimliği kullanılarak ayrılmış ve test aşamasında CNV, DME, DRUSEN ve NORMAL örnekleri binary anomaly detection problemi olarak değerlendirilmiştir. Final aşamasında ara baseline korunmuş; VAE+KL, L1, MSE+SSIM, latent boyut, batch size, crop ön işleme, learning rate scheduler, BatchNorm, farklı anomaly score'lar, hasta düzeyi birleştirme ve bootstrap güven aralığı denemeleri eklenmiştir. En iyi image-level sonuç, BatchNorm ve ReduceLROnPlateau ile 60 epoch eğitilen AE-MSE modelinin topk_mse_5 score'u ile AUROC 0.9487, F1 0.8593, precision 0.9862, recall 0.7613 ve FPR 0.0320 olarak bulunmuştur. Hasta düzeyinde mean aggregation ile F1 0.9089 elde edilmiştir. Sonuçlar top-k residual score'un klasik ortalama MSE'ye göre daha ayırt edici olduğunu, buna karşılık DRUSEN örneklerinin hala en zor patolojik grup olduğunu göstermektedir.</w:t>
+        <w:t>Bu çalışmada retinal OCT görüntülerinde patolojik örneklerin tespiti için yalnızca normal görüntülerle eğitilen konvolüsyonel autoencoder tabanlı bir anomali tespit hattı geliştirilmiştir. Kermany OCT2017/Mendeley veri kümesinde eğitim aşamasına sadece NORMAL sınıfı alınmış, doğrulama bölmesi hasta kimliği kullanılarak ayrılmış ve test aşamasında CNV, DME, DRUSEN ve NORMAL örnekleri binary anomaly detection problemi olarak değerlendirilmiştir. Final aşamasında ara baseline korunmuş; VAE+KL, L1, MSE+SSIM, latent boyut, batch size, crop ön işleme, learning rate scheduler, BatchNorm, 256x256 yüksek çözünürlük, farklı anomaly score'lar, hasta düzeyi birleştirme ve bootstrap güven aralığı denemeleri eklenmiştir. En iyi image-level sonuç, BatchNorm ve ReduceLROnPlateau ile 60 epoch eğitilen AE-MSE modelinin topk_mse_5 score'u ile AUROC 0.9487, F1 0.8593, precision 0.9862, recall 0.7613 ve FPR 0.0320 olarak bulunmuştur. Hasta düzeyinde mean aggregation ile F1 0.9089 elde edilmiştir. Sonuçlar top-k residual score'un klasik ortalama MSE'ye göre daha ayırt edici olduğunu, buna karşılık DRUSEN örneklerinin hala en zor patolojik grup olduğunu göstermektedir.</w:t>
       </w:r>
     </w:p>
     <w:p>
@@ -233,7 +233,7 @@
         <w:t xml:space="preserve">Abstract - </w:t>
       </w:r>
       <w:r>
-        <w:t>This project develops a convolutional autoencoder pipeline for detecting pathological retinal OCT images by learning only from normal samples. Using the Kermany OCT2017/Mendeley dataset, only NORMAL images were used for training, the validation subset was separated at patient level, and CNV, DME, DRUSEN and NORMAL test images were evaluated as a binary anomaly detection task. In the final stage, the baseline was extended with VAE+KL, L1, MSE+SSIM, latent-size and batch-size ablations, crop preprocessing trials, learning-rate scheduling, BatchNorm, alternative anomaly scores, patient-level aggregation and bootstrap confidence intervals. The best image-level setting was the 60-epoch AE-MSE model trained with BatchNorm and ReduceLROnPlateau and evaluated with topk_mse_5 scoring, reaching AUROC 0.9487, F1 0.8593, precision 0.9862, recall 0.7613 and FPR 0.0320. Patient-level mean aggregation achieved F1 0.9089. The findings indicate that localized top-k residual scoring improves separability over mean MSE, while DRUSEN remains the most challenging pathology group.</w:t>
+        <w:t>This project develops a convolutional autoencoder pipeline for detecting pathological retinal OCT images by learning only from normal samples. Using the Kermany OCT2017/Mendeley dataset, only NORMAL images were used for training, the validation subset was separated at patient level, and CNV, DME, DRUSEN and NORMAL test images were evaluated as a binary anomaly detection task. In the final stage, the baseline was extended with VAE+KL, L1, MSE+SSIM, latent-size and batch-size ablations, crop preprocessing trials, learning-rate scheduling, BatchNorm, 256x256 high-resolution training, alternative anomaly scores, patient-level aggregation and bootstrap confidence intervals. The best image-level setting was the 60-epoch AE-MSE model trained with BatchNorm and ReduceLROnPlateau and evaluated with topk_mse_5 scoring, reaching AUROC 0.9487, F1 0.8593, precision 0.9862, recall 0.7613 and FPR 0.0320. Patient-level mean aggregation achieved F1 0.9089. The findings indicate that localized top-k residual scoring improves separability over mean MSE, while DRUSEN remains the most challenging pathology group.</w:t>
       </w:r>
     </w:p>
     <w:p>
@@ -281,7 +281,7 @@
         <w:jc w:val="both"/>
       </w:pPr>
       <w:r>
-        <w:t>Ara rapor aşamasında çalışan bir AE-MSE baseline kurulmuştu. Final aşamasında amaç sadece tek bir sonucu iyileştirmek değil, aynı zamanda hangi teknik kararların işe yaradığını sistematik olarak görmekti. Bu kapsamda VAE tabanlı üretken latent model, L1 ve SSIM içeren loss seçenekleri, latent boyut ve batch size ablasyonları, learning rate scheduler, BatchNorm, boş alanları azaltmaya yönelik crop denemeleri, top-k residual score, hasta düzeyi değerlendirme, bootstrap güven aralığı ve nitel heatmap görselleri aynı deney hattına eklenmiştir. Bu nedenle final raporu ara rapordaki başlangıç fikrini temel almakla birlikte, asıl olarak finalde yapılan genişletmeleri ve bunların kontrollü karşılaştırmasını sunmaktadır. Böylece proje, yalnızca bir model çalıştırma örneği olmaktan çıkarılıp savunulabilir bir karşılaştırmalı analiz haline getirilmiştir.</w:t>
+        <w:t>Ara rapor aşamasında çalışan bir AE-MSE baseline kurulmuştu. Final aşamasında amaç sadece tek bir sonucu iyileştirmek değil, aynı zamanda hangi teknik kararların işe yaradığını sistematik olarak görmekti. Bu kapsamda VAE tabanlı üretken latent model, L1 ve SSIM içeren loss seçenekleri, latent boyut ve batch size ablasyonları, learning rate scheduler, BatchNorm, 256x256 yüksek çözünürlük denemesi, boş alanları azaltmaya yönelik crop denemeleri, top-k residual score, hasta düzeyi değerlendirme, bootstrap güven aralığı ve nitel heatmap görselleri aynı deney hattına eklenmiştir. Bu nedenle final raporu ara rapordaki başlangıç fikrini temel almakla birlikte, asıl olarak finalde yapılan genişletmeleri ve bunların kontrollü karşılaştırmasını sunmaktadır. Böylece proje, yalnızca bir model çalıştırma örneği olmaktan çıkarılıp savunulabilir bir karşılaştırmalı analiz haline getirilmiştir.</w:t>
       </w:r>
     </w:p>
     <w:p>
@@ -333,7 +333,7 @@
       <w:r>
         <w:rPr>
           <w:b/>
-          <w:sz w:val="18"/>
+          <w:sz w:val="20"/>
         </w:rPr>
         <w:t>Tablo I. Literatürdeki ana kümeler ve bu projedeki karşılıkları.</w:t>
       </w:r>
@@ -353,10 +353,10 @@
           <w:insideV w:val="single" w:sz="6" w:space="0" w:color="000000"/>
         </w:tblBorders>
         <w:tblCellMar>
-          <w:top w:w="30" w:type="dxa"/>
-          <w:left w:w="30" w:type="dxa"/>
-          <w:bottom w:w="30" w:type="dxa"/>
-          <w:right w:w="30" w:type="dxa"/>
+          <w:top w:w="45" w:type="dxa"/>
+          <w:left w:w="45" w:type="dxa"/>
+          <w:bottom w:w="45" w:type="dxa"/>
+          <w:right w:w="45" w:type="dxa"/>
         </w:tblCellMar>
       </w:tblPr>
       <w:tblGrid>
@@ -760,6 +760,15 @@
         <w:jc w:val="both"/>
       </w:pPr>
       <w:r>
+        <w:t>Yüksek çözünürlük etkisini görmek için modeldeki 128x128 sabit varsayımı kaldırılmış, encoder çıkışındaki uzamsal boyut image_size/16 olarak dinamik hesaplanmıştır. Böylece dört pooling bloğu sonrasında 128x128 giriş için 8x8, 256x256 giriş için 16x16 feature map kullanılmıştır. Geçersiz boyutların sessizce hatalı sonuç üretmemesi için image_size değerinin 16'ya bölünebilmesi şartı eklenmiştir. 256x256 denemesinde final adayla aynı genel çizgi korunmuş; AE-MSE, BatchNorm, ReduceLROnPlateau, latent_dim=128, batch size 32 ve p95 threshold kullanılmıştır. Bu koşu daha yüksek çözünürlükle küçük patolojik ayrıntıların korunup korunmadığını test etmek için yapılmış, ancak final model seçimi yalnızca sonuçlar görüldükten sonra değiştirilmemiştir.</w:t>
+      </w:r>
+    </w:p>
+    <w:p>
+      <w:pPr>
+        <w:spacing w:after="40" w:line="240" w:lineRule="auto"/>
+        <w:jc w:val="both"/>
+      </w:pPr>
+      <w:r>
         <w:t>Deney tasarımında iki ayrım korunmuştur. Birincisi, training loss ve anomaly score her zaman aynı olmak zorunda değildir; örneğin model MSE ile eğitildikten sonra aynı rekonstrüksiyonlardan farklı score türleri hesaplanmıştır. İkincisi, eşik seçimi ile performans değerlendirmesi ayrılmıştır; p95 eşiği validation normal skorlarından alınmış, test verisi yalnızca bu eşik sabitlendikten sonra değerlendirilmiştir. Bu ayrım, test setine göre threshold ayarlama riskini azaltmıştır.</w:t>
       </w:r>
     </w:p>
@@ -798,7 +807,7 @@
       <w:r>
         <w:rPr>
           <w:b/>
-          <w:sz w:val="18"/>
+          <w:sz w:val="20"/>
         </w:rPr>
         <w:t>Tablo II. Kullanılan veri bölmeleri ve hasta sayıları.</w:t>
       </w:r>
@@ -818,10 +827,10 @@
           <w:insideV w:val="single" w:sz="6" w:space="0" w:color="000000"/>
         </w:tblBorders>
         <w:tblCellMar>
-          <w:top w:w="30" w:type="dxa"/>
-          <w:left w:w="30" w:type="dxa"/>
-          <w:bottom w:w="30" w:type="dxa"/>
-          <w:right w:w="30" w:type="dxa"/>
+          <w:top w:w="45" w:type="dxa"/>
+          <w:left w:w="45" w:type="dxa"/>
+          <w:bottom w:w="45" w:type="dxa"/>
+          <w:right w:w="45" w:type="dxa"/>
         </w:tblCellMar>
       </w:tblPr>
       <w:tblGrid>
@@ -1389,7 +1398,7 @@
       <w:r>
         <w:rPr>
           <w:b/>
-          <w:sz w:val="18"/>
+          <w:sz w:val="20"/>
         </w:rPr>
         <w:t>Tablo III. Final ana koşu ve eğitim ayarları.</w:t>
       </w:r>
@@ -1409,10 +1418,10 @@
           <w:insideV w:val="single" w:sz="6" w:space="0" w:color="000000"/>
         </w:tblBorders>
         <w:tblCellMar>
-          <w:top w:w="30" w:type="dxa"/>
-          <w:left w:w="30" w:type="dxa"/>
-          <w:bottom w:w="30" w:type="dxa"/>
-          <w:right w:w="30" w:type="dxa"/>
+          <w:top w:w="45" w:type="dxa"/>
+          <w:left w:w="45" w:type="dxa"/>
+          <w:bottom w:w="45" w:type="dxa"/>
+          <w:right w:w="45" w:type="dxa"/>
         </w:tblCellMar>
       </w:tblPr>
       <w:tblGrid>
@@ -1910,7 +1919,7 @@
       <w:r>
         <w:drawing>
           <wp:inline xmlns:a="http://schemas.openxmlformats.org/drawingml/2006/main" xmlns:pic="http://schemas.openxmlformats.org/drawingml/2006/picture">
-            <wp:extent cx="2606040" cy="692115"/>
+            <wp:extent cx="2788920" cy="740685"/>
             <wp:docPr id="1" name="Picture 1"/>
             <wp:cNvGraphicFramePr>
               <a:graphicFrameLocks noChangeAspect="1"/>
@@ -1931,7 +1940,7 @@
                   <pic:spPr>
                     <a:xfrm>
                       <a:off x="0" y="0"/>
-                      <a:ext cx="2606040" cy="692115"/>
+                      <a:ext cx="2788920" cy="740685"/>
                     </a:xfrm>
                     <a:prstGeom prst="rect"/>
                   </pic:spPr>
@@ -1949,7 +1958,7 @@
       </w:pPr>
       <w:r>
         <w:rPr>
-          <w:sz w:val="17"/>
+          <w:sz w:val="20"/>
         </w:rPr>
         <w:t>Şekil 1. Önerilen final deney hattı.</w:t>
       </w:r>
@@ -1983,7 +1992,7 @@
         <w:jc w:val="both"/>
       </w:pPr>
       <w:r>
-        <w:t>VAE+KL, L1 ve MSE+SSIM denemeleri beklenen iyileştirmeyi sağlamamıştır. VAE özellikle DRUSEN sınıfında zayıf kalmış, MSE+SSIM ise bu veri ve mimari ayarında en düşük genel performansı vermiştir. Latent 64/128/256 karşılaştırmasında değerler birbirine yakın kalmış, final aday için latent 128 korunmuştur. Batch size 16 güçlü sonuç vermesine rağmen final score'da 60 epoch latent 128 koşusunu geçememiştir. Crop denemelerinde content crop ve retina-margin crop DRUSEN yakalama sayısını bir miktar artırmış, fakat AUROC ve FPR tarafında genel performansı düşürmüştür; bu nedenle final modelde crop kullanılmamıştır.</w:t>
+        <w:t>VAE+KL, L1 ve MSE+SSIM denemeleri beklenen iyileştirmeyi sağlamamıştır. VAE özellikle DRUSEN sınıfında zayıf kalmış, MSE+SSIM ise bu veri ve mimari ayarında en düşük genel performansı vermiştir. Latent 64/128/256 karşılaştırmasında değerler birbirine yakın kalmış, final aday için latent 128 korunmuştur. Batch size 16 güçlü sonuç vermesine rağmen final score'da 60 epoch latent 128 koşusunu geçememiştir. Crop denemelerinde content crop ve retina-margin crop DRUSEN yakalama sayısını bir miktar artırmış, fakat AUROC ve FPR tarafında genel performansı düşürmüştür; bu nedenle final modelde crop kullanılmamıştır. Yüksek çözünürlük denemesi de benzer şekilde olumlu sonuç vermemiştir: 256x256 koşusu 40 epoch sonunda best epoch 37 ve best validation loss 0.001246 üretmiş, ancak topk_mse_5 ile image-level AUROC 0.9204, F1 0.7821 ve DRUSEN tespiti 77/250 seviyesinde kalmıştır. Aynı koşunun hasta düzeyi mean aggregation sonucu AUROC 0.9265 ve F1 0.8721'dir. Bu değerler 128x128 final adayın image-level AUROC 0.9487, F1 0.8593 ve DRUSEN 107/250 sonucunun gerisinde olduğu için yüksek çözünürlük final seçime alınmamıştır.</w:t>
       </w:r>
     </w:p>
     <w:p>
@@ -2019,7 +2028,7 @@
         <w:jc w:val="both"/>
       </w:pPr>
       <w:r>
-        <w:t>VAE sonucunun zayıf kalması da önemli bir bulgudur. VAE'nin daha düzenli bir latent uzay oluşturması beklenebilir; ancak KL terimi rekonstrüksiyonu daha pürüzsüz hale getirerek küçük ve lokal patolojik farklılıkların score'a yansımasını azaltmış olabilir. Benzer şekilde SSIM içeren loss yapısal benzerliği gözetse de, bu veri ve 128x128 çözünürlükte patoloji-normal ayrımını güçlendirmemiştir. Bu sonuçlar negatif görünse de final rapor açısından değerlidir; çünkü hangi geliştirmelerin gerçekten katkı verdiğini, hangilerinin yalnızca teorik olarak cazip kaldığını ayırmaktadır.</w:t>
+        <w:t>VAE sonucunun zayıf kalması da önemli bir bulgudur. VAE'nin daha düzenli bir latent uzay oluşturması beklenebilir; ancak KL terimi rekonstrüksiyonu daha pürüzsüz hale getirerek küçük ve lokal patolojik farklılıkların score'a yansımasını azaltmış olabilir. Benzer şekilde SSIM içeren loss yapısal benzerliği gözetse de, bu veri ve 128x128 çözünürlükte patoloji-normal ayrımını güçlendirmemiştir. 256x256 denemesi ise daha fazla ayrıntıyı korumasına rağmen modelin latent bottleneck ve training ayarlarıyla daha iyi ayrım üretmemiştir; yüksek çözünürlük hem rekonstrüksiyonu hem de normal varyasyonu daha karmaşık hale getirmiş olabilir. Bu sonuçlar negatif görünse de final rapor açısından değerlidir; çünkü hangi geliştirmelerin gerçekten katkı verdiğini, hangilerinin yalnızca teorik olarak cazip kaldığını ayırmaktadır.</w:t>
       </w:r>
     </w:p>
     <w:p>
@@ -2035,7 +2044,7 @@
       <w:r>
         <w:rPr>
           <w:b/>
-          <w:sz w:val="18"/>
+          <w:sz w:val="20"/>
         </w:rPr>
         <w:t>Tablo IV. Final aşamasında yapılan ana deneyler.</w:t>
       </w:r>
@@ -2055,10 +2064,10 @@
           <w:insideV w:val="single" w:sz="6" w:space="0" w:color="000000"/>
         </w:tblBorders>
         <w:tblCellMar>
-          <w:top w:w="30" w:type="dxa"/>
-          <w:left w:w="30" w:type="dxa"/>
-          <w:bottom w:w="30" w:type="dxa"/>
-          <w:right w:w="30" w:type="dxa"/>
+          <w:top w:w="45" w:type="dxa"/>
+          <w:left w:w="45" w:type="dxa"/>
+          <w:bottom w:w="45" w:type="dxa"/>
+          <w:right w:w="45" w:type="dxa"/>
         </w:tblCellMar>
       </w:tblPr>
       <w:tblGrid>
@@ -2903,6 +2912,122 @@
                 <w:rFonts w:ascii="Times New Roman" w:hAnsi="Times New Roman"/>
                 <w:sz w:val="16"/>
               </w:rPr>
+              <w:t>AE 256x256 + top-k</w:t>
+            </w:r>
+          </w:p>
+        </w:tc>
+        <w:tc>
+          <w:tcPr>
+            <w:tcW w:type="dxa" w:w="1668"/>
+            <w:vAlign w:val="center"/>
+          </w:tcPr>
+          <w:p>
+            <w:pPr>
+              <w:spacing w:after="0"/>
+              <w:jc w:val="center"/>
+            </w:pPr>
+            <w:r>
+              <w:rPr>
+                <w:rFonts w:ascii="Times New Roman" w:hAnsi="Times New Roman"/>
+                <w:sz w:val="16"/>
+              </w:rPr>
+              <w:t>0.9204</w:t>
+            </w:r>
+          </w:p>
+        </w:tc>
+        <w:tc>
+          <w:tcPr>
+            <w:tcW w:type="dxa" w:w="1668"/>
+            <w:vAlign w:val="center"/>
+          </w:tcPr>
+          <w:p>
+            <w:pPr>
+              <w:spacing w:after="0"/>
+              <w:jc w:val="center"/>
+            </w:pPr>
+            <w:r>
+              <w:rPr>
+                <w:rFonts w:ascii="Times New Roman" w:hAnsi="Times New Roman"/>
+                <w:sz w:val="16"/>
+              </w:rPr>
+              <w:t>0.7821</w:t>
+            </w:r>
+          </w:p>
+        </w:tc>
+        <w:tc>
+          <w:tcPr>
+            <w:tcW w:type="dxa" w:w="1668"/>
+            <w:vAlign w:val="center"/>
+          </w:tcPr>
+          <w:p>
+            <w:pPr>
+              <w:spacing w:after="0"/>
+              <w:jc w:val="center"/>
+            </w:pPr>
+            <w:r>
+              <w:rPr>
+                <w:rFonts w:ascii="Times New Roman" w:hAnsi="Times New Roman"/>
+                <w:sz w:val="16"/>
+              </w:rPr>
+              <w:t>0.6507</w:t>
+            </w:r>
+          </w:p>
+        </w:tc>
+        <w:tc>
+          <w:tcPr>
+            <w:tcW w:type="dxa" w:w="1668"/>
+            <w:vAlign w:val="center"/>
+          </w:tcPr>
+          <w:p>
+            <w:pPr>
+              <w:spacing w:after="0"/>
+              <w:jc w:val="center"/>
+            </w:pPr>
+            <w:r>
+              <w:rPr>
+                <w:rFonts w:ascii="Times New Roman" w:hAnsi="Times New Roman"/>
+                <w:sz w:val="16"/>
+              </w:rPr>
+              <w:t>0.0400</w:t>
+            </w:r>
+          </w:p>
+        </w:tc>
+        <w:tc>
+          <w:tcPr>
+            <w:tcW w:type="dxa" w:w="1668"/>
+            <w:vAlign w:val="center"/>
+          </w:tcPr>
+          <w:p>
+            <w:pPr>
+              <w:spacing w:after="0"/>
+              <w:jc w:val="center"/>
+            </w:pPr>
+            <w:r>
+              <w:rPr>
+                <w:rFonts w:ascii="Times New Roman" w:hAnsi="Times New Roman"/>
+                <w:sz w:val="16"/>
+              </w:rPr>
+              <w:t>Yüksek çözünürlük; finali geçmedi</w:t>
+            </w:r>
+          </w:p>
+        </w:tc>
+      </w:tr>
+      <w:tr>
+        <w:tc>
+          <w:tcPr>
+            <w:tcW w:type="dxa" w:w="1668"/>
+            <w:vAlign w:val="center"/>
+          </w:tcPr>
+          <w:p>
+            <w:pPr>
+              <w:spacing w:after="0"/>
+              <w:jc w:val="center"/>
+            </w:pPr>
+            <w:r>
+              <w:rPr>
+                <w:rFonts w:ascii="Times New Roman" w:hAnsi="Times New Roman"/>
+                <w:sz w:val="16"/>
+              </w:rPr>
               <w:t>VAE+KL</w:t>
             </w:r>
           </w:p>
@@ -3940,7 +4065,7 @@
       <w:r>
         <w:rPr>
           <w:b/>
-          <w:sz w:val="18"/>
+          <w:sz w:val="20"/>
         </w:rPr>
         <w:t>Tablo V. Final run için score ablation özeti.</w:t>
       </w:r>
@@ -3960,10 +4085,10 @@
           <w:insideV w:val="single" w:sz="6" w:space="0" w:color="000000"/>
         </w:tblBorders>
         <w:tblCellMar>
-          <w:top w:w="30" w:type="dxa"/>
-          <w:left w:w="30" w:type="dxa"/>
-          <w:bottom w:w="30" w:type="dxa"/>
-          <w:right w:w="30" w:type="dxa"/>
+          <w:top w:w="45" w:type="dxa"/>
+          <w:left w:w="45" w:type="dxa"/>
+          <w:bottom w:w="45" w:type="dxa"/>
+          <w:right w:w="45" w:type="dxa"/>
         </w:tblCellMar>
       </w:tblPr>
       <w:tblGrid>
@@ -4860,7 +4985,7 @@
       <w:r>
         <w:rPr>
           <w:b/>
-          <w:sz w:val="18"/>
+          <w:sz w:val="20"/>
         </w:rPr>
         <w:t>Tablo VI. Final aday sonuçları ve bootstrap güven aralıkları.</w:t>
       </w:r>
@@ -4880,10 +5005,10 @@
           <w:insideV w:val="single" w:sz="6" w:space="0" w:color="000000"/>
         </w:tblBorders>
         <w:tblCellMar>
-          <w:top w:w="30" w:type="dxa"/>
-          <w:left w:w="30" w:type="dxa"/>
-          <w:bottom w:w="30" w:type="dxa"/>
-          <w:right w:w="30" w:type="dxa"/>
+          <w:top w:w="45" w:type="dxa"/>
+          <w:left w:w="45" w:type="dxa"/>
+          <w:bottom w:w="45" w:type="dxa"/>
+          <w:right w:w="45" w:type="dxa"/>
         </w:tblCellMar>
       </w:tblPr>
       <w:tblGrid>
@@ -5321,7 +5446,7 @@
       <w:r>
         <w:rPr>
           <w:b/>
-          <w:sz w:val="18"/>
+          <w:sz w:val="20"/>
         </w:rPr>
         <w:t>Tablo VII. topk_mse_5 için eşik duyarlılığı.</w:t>
       </w:r>
@@ -5341,10 +5466,10 @@
           <w:insideV w:val="single" w:sz="6" w:space="0" w:color="000000"/>
         </w:tblBorders>
         <w:tblCellMar>
-          <w:top w:w="30" w:type="dxa"/>
-          <w:left w:w="30" w:type="dxa"/>
-          <w:bottom w:w="30" w:type="dxa"/>
-          <w:right w:w="30" w:type="dxa"/>
+          <w:top w:w="45" w:type="dxa"/>
+          <w:left w:w="45" w:type="dxa"/>
+          <w:bottom w:w="45" w:type="dxa"/>
+          <w:right w:w="45" w:type="dxa"/>
         </w:tblCellMar>
       </w:tblPr>
       <w:tblGrid>
@@ -5834,7 +5959,7 @@
       <w:r>
         <w:rPr>
           <w:b/>
-          <w:sz w:val="18"/>
+          <w:sz w:val="20"/>
         </w:rPr>
         <w:t>Tablo VIII. Final top-k score için sınıf bazlı tespit özeti.</w:t>
       </w:r>
@@ -5854,10 +5979,10 @@
           <w:insideV w:val="single" w:sz="6" w:space="0" w:color="000000"/>
         </w:tblBorders>
         <w:tblCellMar>
-          <w:top w:w="30" w:type="dxa"/>
-          <w:left w:w="30" w:type="dxa"/>
-          <w:bottom w:w="30" w:type="dxa"/>
-          <w:right w:w="30" w:type="dxa"/>
+          <w:top w:w="45" w:type="dxa"/>
+          <w:left w:w="45" w:type="dxa"/>
+          <w:bottom w:w="45" w:type="dxa"/>
+          <w:right w:w="45" w:type="dxa"/>
         </w:tblCellMar>
       </w:tblPr>
       <w:tblGrid>
@@ -6296,7 +6421,7 @@
       <w:r>
         <w:drawing>
           <wp:inline xmlns:a="http://schemas.openxmlformats.org/drawingml/2006/main" xmlns:pic="http://schemas.openxmlformats.org/drawingml/2006/picture">
-            <wp:extent cx="2606040" cy="936222"/>
+            <wp:extent cx="2788920" cy="1001922"/>
             <wp:docPr id="2" name="Picture 2"/>
             <wp:cNvGraphicFramePr>
               <a:graphicFrameLocks noChangeAspect="1"/>
@@ -6317,7 +6442,7 @@
                   <pic:spPr>
                     <a:xfrm>
                       <a:off x="0" y="0"/>
-                      <a:ext cx="2606040" cy="936222"/>
+                      <a:ext cx="2788920" cy="1001922"/>
                     </a:xfrm>
                     <a:prstGeom prst="rect"/>
                   </pic:spPr>
@@ -6335,7 +6460,7 @@
       </w:pPr>
       <w:r>
         <w:rPr>
-          <w:sz w:val="17"/>
+          <w:sz w:val="20"/>
         </w:rPr>
         <w:t>Şekil 2. Final performans ve sınıf bazlı tespit özeti.</w:t>
       </w:r>
@@ -6348,7 +6473,7 @@
       <w:r>
         <w:drawing>
           <wp:inline xmlns:a="http://schemas.openxmlformats.org/drawingml/2006/main" xmlns:pic="http://schemas.openxmlformats.org/drawingml/2006/picture">
-            <wp:extent cx="2331720" cy="3031236"/>
+            <wp:extent cx="2788920" cy="3625596"/>
             <wp:docPr id="3" name="Picture 3"/>
             <wp:cNvGraphicFramePr>
               <a:graphicFrameLocks noChangeAspect="1"/>
@@ -6369,7 +6494,7 @@
                   <pic:spPr>
                     <a:xfrm>
                       <a:off x="0" y="0"/>
-                      <a:ext cx="2331720" cy="3031236"/>
+                      <a:ext cx="2788920" cy="3625596"/>
                     </a:xfrm>
                     <a:prstGeom prst="rect"/>
                   </pic:spPr>
@@ -6387,7 +6512,7 @@
       </w:pPr>
       <w:r>
         <w:rPr>
-          <w:sz w:val="17"/>
+          <w:sz w:val="20"/>
         </w:rPr>
         <w:t>Şekil 3. Top-k residual overlay ile nitel analiz örnekleri.</w:t>
       </w:r>
@@ -6400,7 +6525,7 @@
       <w:r>
         <w:drawing>
           <wp:inline xmlns:a="http://schemas.openxmlformats.org/drawingml/2006/main" xmlns:pic="http://schemas.openxmlformats.org/drawingml/2006/picture">
-            <wp:extent cx="2331720" cy="3031236"/>
+            <wp:extent cx="2788920" cy="3625596"/>
             <wp:docPr id="4" name="Picture 4"/>
             <wp:cNvGraphicFramePr>
               <a:graphicFrameLocks noChangeAspect="1"/>
@@ -6421,7 +6546,7 @@
                   <pic:spPr>
                     <a:xfrm>
                       <a:off x="0" y="0"/>
-                      <a:ext cx="2331720" cy="3031236"/>
+                      <a:ext cx="2788920" cy="3625596"/>
                     </a:xfrm>
                     <a:prstGeom prst="rect"/>
                   </pic:spPr>
@@ -6439,7 +6564,7 @@
       </w:pPr>
       <w:r>
         <w:rPr>
-          <w:sz w:val="17"/>
+          <w:sz w:val="20"/>
         </w:rPr>
         <w:t>Şekil 4. DRUSEN false negative örnekleri.</w:t>
       </w:r>
@@ -6473,7 +6598,7 @@
         <w:jc w:val="both"/>
       </w:pPr>
       <w:r>
-        <w:t>Deneyler VAE, L1, MSE+SSIM, latent boyut, batch size ve crop gibi seçeneklerin bu veri ve ayarlarda her zaman iyileştirme getirmediğini göstermiştir. BatchNorm ise validation loss, image-level F1 ve DRUSEN tespit sayısında küçük ama tutarlı bir artış sağlamıştır. Özellikle crop işlemleri DRUSEN yakalamayı artırsa bile genel hata dengesini bozmuştur. Çalışmanın ana sınırlılıkları, test setinin sınıf başına 250 görüntüyle sınırlı tutulması, pixel-level lezyon anotasyonu bulunmaması ve modelin klinik karar destek sistemi olarak kullanılmaya hazır olmamasıdır. Bu nedenle geliştirilen sistem klinik tanı verme amacıyla değil, ders kapsamında değerlendirilen akademik bir anomaly detection baseline olarak ele alınmalıdır. Buna rağmen hasta bazlı split, testten bağımsız threshold seçimi, bootstrap güven aralığı ve nitel residual analizleriyle proje, final teslimi için tutarlı ve tekrar üretilebilir bir normal-only OCT anomaly detection baseline sunmaktadır.</w:t>
+        <w:t>Deneyler VAE, L1, MSE+SSIM, latent boyut, batch size, crop ve 256x256 yüksek çözünürlük gibi seçeneklerin bu veri ve ayarlarda her zaman iyileştirme getirmediğini göstermiştir. BatchNorm ise validation loss, image-level F1 ve DRUSEN tespit sayısında küçük ama tutarlı bir artış sağlamıştır. Özellikle crop işlemleri DRUSEN yakalamayı artırsa bile genel hata dengesini bozmuştur; 256x256 denemesi ise daha yüksek hesaplama maliyetine rağmen 128x128 final adayın gerisinde kalmıştır. Çalışmanın ana sınırlılıkları, test setinin sınıf başına 250 görüntüyle sınırlı tutulması, pixel-level lezyon anotasyonu bulunmaması ve modelin klinik karar destek sistemi olarak kullanılmaya hazır olmamasıdır. Bu nedenle geliştirilen sistem klinik tanı verme amacıyla değil, ders kapsamında değerlendirilen akademik bir anomaly detection baseline olarak ele alınmalıdır. Buna rağmen hasta bazlı split, testten bağımsız threshold seçimi, bootstrap güven aralığı ve nitel residual analizleriyle proje, final teslimi için tutarlı ve tekrar üretilebilir bir normal-only OCT anomaly detection baseline sunmaktadır.</w:t>
       </w:r>
     </w:p>
     <w:p>
@@ -6482,7 +6607,7 @@
         <w:jc w:val="both"/>
       </w:pPr>
       <w:r>
-        <w:t>Final sonrası en doğal geliştirme yönleri, daha yüksek çözünürlükte eğitim, dış veri setinde doğrulama, DRUSEN odaklı ek analiz ve pixel-level anotasyon varsa gerçek anomaly localization değerlendirmesidir. Bununla birlikte bu çalışma kapsamında hedeflenen ana çıktı tamamlanmıştır: normal-only öğrenme yaklaşımı çalıştırılmış, başarısız denemeler saklanmadan raporlanmış ve final model seçimi yalnızca test performansına göre değil, validation tabanlı threshold, sınıf bazlı davranış ve hasta düzeyi analiz birlikte düşünülerek yapılmıştır. Tekrarlanabilirlik için kaynak kod, metrik çıktıları, final aday checkpoint'i ve rapor artefaktları GitHub deposunda tutulmuş; büyük boyutlu OCT2017 veri seti ise depo dışında bırakılmıştır.</w:t>
+        <w:t>Final sonrası en doğal geliştirme yönleri, 256x256 çözünürlük için daha uygun bir bottleneck tasarımı, dış veri setinde doğrulama, DRUSEN odaklı ek analiz ve pixel-level anotasyon varsa gerçek anomaly localization değerlendirmesidir. Bununla birlikte bu çalışma kapsamında hedeflenen ana çıktı tamamlanmıştır: normal-only öğrenme yaklaşımı çalıştırılmış, başarısız denemeler saklanmadan raporlanmış ve final model seçimi yalnızca test performansına göre değil, validation tabanlı threshold, sınıf bazlı davranış ve hasta düzeyi analiz birlikte düşünülerek yapılmıştır. Tekrarlanabilirlik için kaynak kod, metrik çıktıları, final aday checkpoint'i ve rapor artefaktları GitHub deposunda tutulmuş; büyük boyutlu OCT2017 veri seti ise depo dışında bırakılmıştır.</w:t>
       </w:r>
     </w:p>
     <w:p>
@@ -6519,156 +6644,156 @@
     </w:p>
     <w:p>
       <w:pPr>
-        <w:spacing w:after="0" w:line="221" w:lineRule="auto"/>
+        <w:spacing w:after="20" w:line="240" w:lineRule="auto"/>
         <w:jc w:val="left"/>
       </w:pPr>
       <w:r>
         <w:rPr>
           <w:rFonts w:ascii="Times New Roman" w:hAnsi="Times New Roman"/>
-          <w:sz w:val="14"/>
+          <w:sz w:val="16"/>
         </w:rPr>
         <w:t>[1] D. S. Kermany et al., "Identifying medical diagnoses and treatable diseases by image-based deep learning," Cell, vol. 172, no. 5, pp. 1122-1131.e9, 2018, doi: 10.1016/j.cell.2018.02.010.</w:t>
       </w:r>
     </w:p>
     <w:p>
       <w:pPr>
-        <w:spacing w:after="0" w:line="221" w:lineRule="auto"/>
+        <w:spacing w:after="20" w:line="240" w:lineRule="auto"/>
         <w:jc w:val="left"/>
       </w:pPr>
       <w:r>
         <w:rPr>
           <w:rFonts w:ascii="Times New Roman" w:hAnsi="Times New Roman"/>
-          <w:sz w:val="14"/>
+          <w:sz w:val="16"/>
         </w:rPr>
         <w:t>[2] D. S. Kermany, K. Zhang, and M. Goldbaum, "Large dataset of labeled optical coherence tomography (OCT) and chest X-ray images," Mendeley Data, ver. 3, 2018, doi: 10.17632/rscbjbr9sj.3.</w:t>
       </w:r>
     </w:p>
     <w:p>
       <w:pPr>
-        <w:spacing w:after="0" w:line="221" w:lineRule="auto"/>
+        <w:spacing w:after="20" w:line="240" w:lineRule="auto"/>
         <w:jc w:val="left"/>
       </w:pPr>
       <w:r>
         <w:rPr>
           <w:rFonts w:ascii="Times New Roman" w:hAnsi="Times New Roman"/>
-          <w:sz w:val="14"/>
+          <w:sz w:val="16"/>
         </w:rPr>
         <w:t>[3] G. Litjens et al., "A survey on deep learning in medical image analysis," Med. Image Anal., vol. 42, pp. 60-88, 2017, doi: 10.1016/j.media.2017.07.005.</w:t>
       </w:r>
     </w:p>
     <w:p>
       <w:pPr>
-        <w:spacing w:after="0" w:line="221" w:lineRule="auto"/>
+        <w:spacing w:after="20" w:line="240" w:lineRule="auto"/>
         <w:jc w:val="left"/>
       </w:pPr>
       <w:r>
         <w:rPr>
           <w:rFonts w:ascii="Times New Roman" w:hAnsi="Times New Roman"/>
-          <w:sz w:val="14"/>
+          <w:sz w:val="16"/>
         </w:rPr>
         <w:t>[4] D. P. Kingma and M. Welling, "Auto-Encoding Variational Bayes," arXiv:1312.6114, 2013.</w:t>
       </w:r>
     </w:p>
     <w:p>
       <w:pPr>
-        <w:spacing w:after="0" w:line="221" w:lineRule="auto"/>
+        <w:spacing w:after="20" w:line="240" w:lineRule="auto"/>
         <w:jc w:val="left"/>
       </w:pPr>
       <w:r>
         <w:rPr>
           <w:rFonts w:ascii="Times New Roman" w:hAnsi="Times New Roman"/>
-          <w:sz w:val="14"/>
+          <w:sz w:val="16"/>
         </w:rPr>
         <w:t>[5] Z. Wang, A. C. Bovik, H. R. Sheikh, and E. P. Simoncelli, "Image quality assessment: From error visibility to structural similarity," IEEE Trans. Image Process., vol. 13, no. 4, pp. 600-612, 2004, doi: 10.1109/TIP.2003.819861.</w:t>
       </w:r>
     </w:p>
     <w:p>
       <w:pPr>
-        <w:spacing w:after="0" w:line="221" w:lineRule="auto"/>
+        <w:spacing w:after="20" w:line="240" w:lineRule="auto"/>
         <w:jc w:val="left"/>
       </w:pPr>
       <w:r>
         <w:rPr>
           <w:rFonts w:ascii="Times New Roman" w:hAnsi="Times New Roman"/>
-          <w:sz w:val="14"/>
+          <w:sz w:val="16"/>
         </w:rPr>
         <w:t>[6] T. Schlegl, P. Seebock, S. M. Waldstein, U. Schmidt-Erfurth, and G. Langs, "Unsupervised anomaly detection with generative adversarial networks to guide marker discovery," arXiv:1703.05921, 2017, doi: 10.48550/arXiv.1703.05921.</w:t>
       </w:r>
     </w:p>
     <w:p>
       <w:pPr>
-        <w:spacing w:after="0" w:line="221" w:lineRule="auto"/>
+        <w:spacing w:after="20" w:line="240" w:lineRule="auto"/>
         <w:jc w:val="left"/>
       </w:pPr>
       <w:r>
         <w:rPr>
           <w:rFonts w:ascii="Times New Roman" w:hAnsi="Times New Roman"/>
-          <w:sz w:val="14"/>
+          <w:sz w:val="16"/>
         </w:rPr>
         <w:t>[7] S. Akcay, A. Atapour-Abarghouei, and T. P. Breckon, "GANomaly: Semi-supervised anomaly detection via adversarial training," in Proc. Asian Conf. Comput. Vis. (ACCV), pp. 622-637, 2018, doi: 10.1007/978-3-030-20893-6_39.</w:t>
       </w:r>
     </w:p>
     <w:p>
       <w:pPr>
-        <w:spacing w:after="0" w:line="221" w:lineRule="auto"/>
+        <w:spacing w:after="20" w:line="240" w:lineRule="auto"/>
         <w:jc w:val="left"/>
       </w:pPr>
       <w:r>
         <w:rPr>
           <w:rFonts w:ascii="Times New Roman" w:hAnsi="Times New Roman"/>
-          <w:sz w:val="14"/>
+          <w:sz w:val="16"/>
         </w:rPr>
         <w:t>[8] V. Zavrtanik, M. Kristan, and D. Skocaj, "DRAEM - A discriminatively trained reconstruction embedding for surface anomaly detection," in Proc. IEEE/CVF Int. Conf. Comput. Vis. (ICCV), pp. 8330-8339, 2021.</w:t>
       </w:r>
     </w:p>
     <w:p>
       <w:pPr>
-        <w:spacing w:after="0" w:line="221" w:lineRule="auto"/>
+        <w:spacing w:after="20" w:line="240" w:lineRule="auto"/>
         <w:jc w:val="left"/>
       </w:pPr>
       <w:r>
         <w:rPr>
           <w:rFonts w:ascii="Times New Roman" w:hAnsi="Times New Roman"/>
-          <w:sz w:val="14"/>
+          <w:sz w:val="16"/>
         </w:rPr>
         <w:t>[9] P. Seebock et al., "Exploiting epistemic uncertainty of anatomy segmentation for anomaly detection in retinal OCT," IEEE Trans. Med. Imaging, vol. 39, no. 1, pp. 87-98, 2020, doi: 10.1109/TMI.2019.2919951.</w:t>
       </w:r>
     </w:p>
     <w:p>
       <w:pPr>
-        <w:spacing w:after="0" w:line="221" w:lineRule="auto"/>
+        <w:spacing w:after="20" w:line="240" w:lineRule="auto"/>
         <w:jc w:val="left"/>
       </w:pPr>
       <w:r>
         <w:rPr>
           <w:rFonts w:ascii="Times New Roman" w:hAnsi="Times New Roman"/>
-          <w:sz w:val="14"/>
+          <w:sz w:val="16"/>
         </w:rPr>
         <w:t>[10] K. Zhou et al., "Proxy-bridged image reconstruction network for anomaly detection in medical images," IEEE Trans. Med. Imaging, vol. 41, no. 3, pp. 582-594, 2022, doi: 10.1109/TMI.2021.3118223.</w:t>
       </w:r>
     </w:p>
     <w:p>
       <w:pPr>
-        <w:spacing w:after="0" w:line="221" w:lineRule="auto"/>
+        <w:spacing w:after="20" w:line="240" w:lineRule="auto"/>
         <w:jc w:val="left"/>
       </w:pPr>
       <w:r>
         <w:rPr>
           <w:rFonts w:ascii="Times New Roman" w:hAnsi="Times New Roman"/>
-          <w:sz w:val="14"/>
+          <w:sz w:val="16"/>
         </w:rPr>
         <w:t>[11] Y. Luo, Y. Ma, and Z. Yang, "Multi-resolution auto-encoder for anomaly detection of retinal imaging," Phys. Eng. Sci. Med., vol. 47, no. 2, pp. 517-529, 2024, doi: 10.1007/s13246-023-01381-x.</w:t>
       </w:r>
     </w:p>
     <w:p>
       <w:pPr>
-        <w:spacing w:after="0" w:line="221" w:lineRule="auto"/>
+        <w:spacing w:after="20" w:line="240" w:lineRule="auto"/>
         <w:jc w:val="left"/>
       </w:pPr>
       <w:r>
         <w:rPr>
           <w:rFonts w:ascii="Times New Roman" w:hAnsi="Times New Roman"/>
-          <w:sz w:val="14"/>
+          <w:sz w:val="16"/>
         </w:rPr>
         <w:t>[12] J. Wang, W. Li, Y. Chen, et al., "Weakly supervised anomaly segmentation in retinal OCT images using an adversarial learning approach," Biomed. Opt. Express, vol. 12, no. 8, pp. 4713-4729, 2021, doi: 10.1364/BOE.426803.</w:t>
       </w:r>

</xml_diff>